<commit_message>
docs(slot14): submit progress test report and completed project
</commit_message>
<xml_diff>
--- a/Slot14/ProgressTest_HSF302_TranHuuHa.docx
+++ b/Slot14/ProgressTest_HSF302_TranHuuHa.docx
@@ -6,6 +6,9 @@
       <w:pPr>
         <w:spacing w:before="480" w:after="160"/>
         <w:jc w:val="center"/>
+        <w:rPr>
+          <w:rFonts w:ascii="Times New Roman" w:hAnsi="Times New Roman" w:cs="Times New Roman"/>
+        </w:rPr>
       </w:pPr>
       <w:r>
         <w:rPr>
@@ -116,6 +119,9 @@
       <w:pPr>
         <w:spacing w:after="400"/>
         <w:jc w:val="center"/>
+        <w:rPr>
+          <w:rFonts w:ascii="Times New Roman" w:hAnsi="Times New Roman" w:cs="Times New Roman"/>
+        </w:rPr>
       </w:pPr>
       <w:r>
         <w:rPr>
@@ -140,6 +146,9 @@
       <w:pPr>
         <w:spacing w:after="280"/>
         <w:jc w:val="center"/>
+        <w:rPr>
+          <w:rFonts w:ascii="Times New Roman" w:hAnsi="Times New Roman" w:cs="Times New Roman"/>
+        </w:rPr>
       </w:pPr>
       <w:r>
         <w:rPr>
@@ -167,6 +176,9 @@
       </w:pPr>
       <w:bookmarkStart w:id="0" w:name="_Toc243839295"/>
       <w:r>
+        <w:rPr>
+          <w:rFonts w:cs="Times New Roman"/>
+        </w:rPr>
         <w:t>MỤC</w:t>
       </w:r>
       <w:r>
@@ -181,6 +193,12 @@
     </w:p>
     <w:sdt>
       <w:sdtPr>
+        <w:rPr>
+          <w:rFonts w:ascii="Times New Roman" w:eastAsiaTheme="minorEastAsia" w:hAnsi="Times New Roman" w:cs="Times New Roman"/>
+          <w:color w:val="auto"/>
+          <w:sz w:val="22"/>
+          <w:szCs w:val="22"/>
+        </w:rPr>
         <w:id w:val="-167259990"/>
         <w:docPartObj>
           <w:docPartGallery w:val="Table of Contents"/>
@@ -189,26 +207,24 @@
       </w:sdtPr>
       <w:sdtEndPr>
         <w:rPr>
-          <w:rFonts w:asciiTheme="minorHAnsi" w:eastAsiaTheme="minorEastAsia" w:hAnsiTheme="minorHAnsi" w:cstheme="minorBidi"/>
           <w:b/>
           <w:bCs/>
           <w:noProof/>
-          <w:color w:val="auto"/>
-          <w:sz w:val="22"/>
-          <w:szCs w:val="22"/>
         </w:rPr>
       </w:sdtEndPr>
       <w:sdtContent>
         <w:p>
           <w:pPr>
             <w:pStyle w:val="TOCHeading"/>
+            <w:rPr>
+              <w:rFonts w:ascii="Times New Roman" w:hAnsi="Times New Roman" w:cs="Times New Roman"/>
+            </w:rPr>
           </w:pPr>
         </w:p>
         <w:p>
           <w:pPr>
             <w:pStyle w:val="TOC1"/>
             <w:rPr>
-              <w:rFonts w:asciiTheme="minorHAnsi" w:hAnsiTheme="minorHAnsi" w:cstheme="minorBidi"/>
               <w:b w:val="0"/>
               <w:bCs w:val="0"/>
               <w:kern w:val="2"/>
@@ -279,7 +295,6 @@
           <w:pPr>
             <w:pStyle w:val="TOC1"/>
             <w:rPr>
-              <w:rFonts w:asciiTheme="minorHAnsi" w:hAnsiTheme="minorHAnsi" w:cstheme="minorBidi"/>
               <w:b w:val="0"/>
               <w:bCs w:val="0"/>
               <w:kern w:val="2"/>
@@ -296,7 +311,6 @@
             </w:r>
             <w:r>
               <w:rPr>
-                <w:rFonts w:asciiTheme="minorHAnsi" w:hAnsiTheme="minorHAnsi" w:cstheme="minorBidi"/>
                 <w:b w:val="0"/>
                 <w:bCs w:val="0"/>
                 <w:kern w:val="2"/>
@@ -362,6 +376,7 @@
               <w:tab w:val="right" w:leader="dot" w:pos="9926"/>
             </w:tabs>
             <w:rPr>
+              <w:rFonts w:ascii="Times New Roman" w:hAnsi="Times New Roman" w:cs="Times New Roman"/>
               <w:noProof/>
               <w:kern w:val="2"/>
               <w:sz w:val="24"/>
@@ -374,12 +389,14 @@
             <w:r>
               <w:rPr>
                 <w:rStyle w:val="Hyperlink"/>
+                <w:rFonts w:ascii="Times New Roman" w:hAnsi="Times New Roman" w:cs="Times New Roman"/>
                 <w:noProof/>
               </w:rPr>
               <w:t>1.1.</w:t>
             </w:r>
             <w:r>
               <w:rPr>
+                <w:rFonts w:ascii="Times New Roman" w:hAnsi="Times New Roman" w:cs="Times New Roman"/>
                 <w:noProof/>
                 <w:kern w:val="2"/>
                 <w:sz w:val="24"/>
@@ -392,13 +409,14 @@
             <w:r>
               <w:rPr>
                 <w:rStyle w:val="Hyperlink"/>
-                <w:rFonts w:cs="Times New Roman"/>
+                <w:rFonts w:ascii="Times New Roman" w:hAnsi="Times New Roman" w:cs="Times New Roman"/>
                 <w:noProof/>
               </w:rPr>
               <w:t>STEP 1 — Tạo project Spring Boot &amp; Cấu hình Dependencies</w:t>
             </w:r>
             <w:r>
               <w:rPr>
+                <w:rFonts w:ascii="Times New Roman" w:hAnsi="Times New Roman" w:cs="Times New Roman"/>
                 <w:noProof/>
                 <w:webHidden/>
               </w:rPr>
@@ -406,6 +424,7 @@
             </w:r>
             <w:r>
               <w:rPr>
+                <w:rFonts w:ascii="Times New Roman" w:hAnsi="Times New Roman" w:cs="Times New Roman"/>
                 <w:noProof/>
                 <w:webHidden/>
               </w:rPr>
@@ -413,6 +432,7 @@
             </w:r>
             <w:r>
               <w:rPr>
+                <w:rFonts w:ascii="Times New Roman" w:hAnsi="Times New Roman" w:cs="Times New Roman"/>
                 <w:noProof/>
                 <w:webHidden/>
               </w:rPr>
@@ -420,12 +440,14 @@
             </w:r>
             <w:r>
               <w:rPr>
+                <w:rFonts w:ascii="Times New Roman" w:hAnsi="Times New Roman" w:cs="Times New Roman"/>
                 <w:noProof/>
                 <w:webHidden/>
               </w:rPr>
             </w:r>
             <w:r>
               <w:rPr>
+                <w:rFonts w:ascii="Times New Roman" w:hAnsi="Times New Roman" w:cs="Times New Roman"/>
                 <w:noProof/>
                 <w:webHidden/>
               </w:rPr>
@@ -433,6 +455,7 @@
             </w:r>
             <w:r>
               <w:rPr>
+                <w:rFonts w:ascii="Times New Roman" w:hAnsi="Times New Roman" w:cs="Times New Roman"/>
                 <w:noProof/>
                 <w:webHidden/>
               </w:rPr>
@@ -440,6 +463,7 @@
             </w:r>
             <w:r>
               <w:rPr>
+                <w:rFonts w:ascii="Times New Roman" w:hAnsi="Times New Roman" w:cs="Times New Roman"/>
                 <w:noProof/>
                 <w:webHidden/>
               </w:rPr>
@@ -455,6 +479,7 @@
               <w:tab w:val="right" w:leader="dot" w:pos="9926"/>
             </w:tabs>
             <w:rPr>
+              <w:rFonts w:ascii="Times New Roman" w:hAnsi="Times New Roman" w:cs="Times New Roman"/>
               <w:noProof/>
               <w:kern w:val="2"/>
               <w:sz w:val="24"/>
@@ -467,12 +492,14 @@
             <w:r>
               <w:rPr>
                 <w:rStyle w:val="Hyperlink"/>
+                <w:rFonts w:ascii="Times New Roman" w:hAnsi="Times New Roman" w:cs="Times New Roman"/>
                 <w:noProof/>
               </w:rPr>
               <w:t>1.2.</w:t>
             </w:r>
             <w:r>
               <w:rPr>
+                <w:rFonts w:ascii="Times New Roman" w:hAnsi="Times New Roman" w:cs="Times New Roman"/>
                 <w:noProof/>
                 <w:kern w:val="2"/>
                 <w:sz w:val="24"/>
@@ -485,12 +512,14 @@
             <w:r>
               <w:rPr>
                 <w:rStyle w:val="Hyperlink"/>
+                <w:rFonts w:ascii="Times New Roman" w:hAnsi="Times New Roman" w:cs="Times New Roman"/>
                 <w:noProof/>
               </w:rPr>
               <w:t>STEP 2 — Cài đặt Bootstrap 5.3 Offline &amp; CSS Tùy chỉnh</w:t>
             </w:r>
             <w:r>
               <w:rPr>
+                <w:rFonts w:ascii="Times New Roman" w:hAnsi="Times New Roman" w:cs="Times New Roman"/>
                 <w:noProof/>
                 <w:webHidden/>
               </w:rPr>
@@ -498,6 +527,7 @@
             </w:r>
             <w:r>
               <w:rPr>
+                <w:rFonts w:ascii="Times New Roman" w:hAnsi="Times New Roman" w:cs="Times New Roman"/>
                 <w:noProof/>
                 <w:webHidden/>
               </w:rPr>
@@ -505,6 +535,7 @@
             </w:r>
             <w:r>
               <w:rPr>
+                <w:rFonts w:ascii="Times New Roman" w:hAnsi="Times New Roman" w:cs="Times New Roman"/>
                 <w:noProof/>
                 <w:webHidden/>
               </w:rPr>
@@ -512,12 +543,14 @@
             </w:r>
             <w:r>
               <w:rPr>
+                <w:rFonts w:ascii="Times New Roman" w:hAnsi="Times New Roman" w:cs="Times New Roman"/>
                 <w:noProof/>
                 <w:webHidden/>
               </w:rPr>
             </w:r>
             <w:r>
               <w:rPr>
+                <w:rFonts w:ascii="Times New Roman" w:hAnsi="Times New Roman" w:cs="Times New Roman"/>
                 <w:noProof/>
                 <w:webHidden/>
               </w:rPr>
@@ -525,6 +558,7 @@
             </w:r>
             <w:r>
               <w:rPr>
+                <w:rFonts w:ascii="Times New Roman" w:hAnsi="Times New Roman" w:cs="Times New Roman"/>
                 <w:noProof/>
                 <w:webHidden/>
               </w:rPr>
@@ -532,6 +566,7 @@
             </w:r>
             <w:r>
               <w:rPr>
+                <w:rFonts w:ascii="Times New Roman" w:hAnsi="Times New Roman" w:cs="Times New Roman"/>
                 <w:noProof/>
                 <w:webHidden/>
               </w:rPr>
@@ -547,6 +582,7 @@
               <w:tab w:val="right" w:leader="dot" w:pos="9926"/>
             </w:tabs>
             <w:rPr>
+              <w:rFonts w:ascii="Times New Roman" w:hAnsi="Times New Roman" w:cs="Times New Roman"/>
               <w:noProof/>
               <w:kern w:val="2"/>
               <w:sz w:val="24"/>
@@ -559,12 +595,14 @@
             <w:r>
               <w:rPr>
                 <w:rStyle w:val="Hyperlink"/>
+                <w:rFonts w:ascii="Times New Roman" w:hAnsi="Times New Roman" w:cs="Times New Roman"/>
                 <w:noProof/>
               </w:rPr>
               <w:t>1.3.</w:t>
             </w:r>
             <w:r>
               <w:rPr>
+                <w:rFonts w:ascii="Times New Roman" w:hAnsi="Times New Roman" w:cs="Times New Roman"/>
                 <w:noProof/>
                 <w:kern w:val="2"/>
                 <w:sz w:val="24"/>
@@ -577,12 +615,14 @@
             <w:r>
               <w:rPr>
                 <w:rStyle w:val="Hyperlink"/>
+                <w:rFonts w:ascii="Times New Roman" w:hAnsi="Times New Roman" w:cs="Times New Roman"/>
                 <w:noProof/>
               </w:rPr>
               <w:t>STEP 3 — Chuẩn bị Cơ sở dữ liệu SQL Server (StudentDB)</w:t>
             </w:r>
             <w:r>
               <w:rPr>
+                <w:rFonts w:ascii="Times New Roman" w:hAnsi="Times New Roman" w:cs="Times New Roman"/>
                 <w:noProof/>
                 <w:webHidden/>
               </w:rPr>
@@ -590,6 +630,7 @@
             </w:r>
             <w:r>
               <w:rPr>
+                <w:rFonts w:ascii="Times New Roman" w:hAnsi="Times New Roman" w:cs="Times New Roman"/>
                 <w:noProof/>
                 <w:webHidden/>
               </w:rPr>
@@ -597,6 +638,7 @@
             </w:r>
             <w:r>
               <w:rPr>
+                <w:rFonts w:ascii="Times New Roman" w:hAnsi="Times New Roman" w:cs="Times New Roman"/>
                 <w:noProof/>
                 <w:webHidden/>
               </w:rPr>
@@ -604,12 +646,14 @@
             </w:r>
             <w:r>
               <w:rPr>
+                <w:rFonts w:ascii="Times New Roman" w:hAnsi="Times New Roman" w:cs="Times New Roman"/>
                 <w:noProof/>
                 <w:webHidden/>
               </w:rPr>
             </w:r>
             <w:r>
               <w:rPr>
+                <w:rFonts w:ascii="Times New Roman" w:hAnsi="Times New Roman" w:cs="Times New Roman"/>
                 <w:noProof/>
                 <w:webHidden/>
               </w:rPr>
@@ -617,6 +661,7 @@
             </w:r>
             <w:r>
               <w:rPr>
+                <w:rFonts w:ascii="Times New Roman" w:hAnsi="Times New Roman" w:cs="Times New Roman"/>
                 <w:noProof/>
                 <w:webHidden/>
               </w:rPr>
@@ -624,6 +669,7 @@
             </w:r>
             <w:r>
               <w:rPr>
+                <w:rFonts w:ascii="Times New Roman" w:hAnsi="Times New Roman" w:cs="Times New Roman"/>
                 <w:noProof/>
                 <w:webHidden/>
               </w:rPr>
@@ -639,6 +685,7 @@
               <w:tab w:val="right" w:leader="dot" w:pos="9926"/>
             </w:tabs>
             <w:rPr>
+              <w:rFonts w:ascii="Times New Roman" w:hAnsi="Times New Roman" w:cs="Times New Roman"/>
               <w:noProof/>
               <w:kern w:val="2"/>
               <w:sz w:val="24"/>
@@ -651,12 +698,14 @@
             <w:r>
               <w:rPr>
                 <w:rStyle w:val="Hyperlink"/>
+                <w:rFonts w:ascii="Times New Roman" w:hAnsi="Times New Roman" w:cs="Times New Roman"/>
                 <w:noProof/>
               </w:rPr>
               <w:t>1.4.</w:t>
             </w:r>
             <w:r>
               <w:rPr>
+                <w:rFonts w:ascii="Times New Roman" w:hAnsi="Times New Roman" w:cs="Times New Roman"/>
                 <w:noProof/>
                 <w:kern w:val="2"/>
                 <w:sz w:val="24"/>
@@ -669,26 +718,14 @@
             <w:r>
               <w:rPr>
                 <w:rStyle w:val="Hyperlink"/>
+                <w:rFonts w:ascii="Times New Roman" w:hAnsi="Times New Roman" w:cs="Times New Roman"/>
                 <w:noProof/>
               </w:rPr>
-              <w:t>STEP</w:t>
+              <w:t>STEP 4 — Cấu hình application.properties &amp; messages.properties (TODO 17)</w:t>
             </w:r>
             <w:r>
               <w:rPr>
-                <w:rStyle w:val="Hyperlink"/>
-                <w:noProof/>
-              </w:rPr>
-              <w:t xml:space="preserve"> </w:t>
-            </w:r>
-            <w:r>
-              <w:rPr>
-                <w:rStyle w:val="Hyperlink"/>
-                <w:noProof/>
-              </w:rPr>
-              <w:t>4 — Cấu hình application.properties &amp; messages.properties (TODO 17)</w:t>
-            </w:r>
-            <w:r>
-              <w:rPr>
+                <w:rFonts w:ascii="Times New Roman" w:hAnsi="Times New Roman" w:cs="Times New Roman"/>
                 <w:noProof/>
                 <w:webHidden/>
               </w:rPr>
@@ -696,6 +733,7 @@
             </w:r>
             <w:r>
               <w:rPr>
+                <w:rFonts w:ascii="Times New Roman" w:hAnsi="Times New Roman" w:cs="Times New Roman"/>
                 <w:noProof/>
                 <w:webHidden/>
               </w:rPr>
@@ -703,6 +741,7 @@
             </w:r>
             <w:r>
               <w:rPr>
+                <w:rFonts w:ascii="Times New Roman" w:hAnsi="Times New Roman" w:cs="Times New Roman"/>
                 <w:noProof/>
                 <w:webHidden/>
               </w:rPr>
@@ -710,12 +749,14 @@
             </w:r>
             <w:r>
               <w:rPr>
+                <w:rFonts w:ascii="Times New Roman" w:hAnsi="Times New Roman" w:cs="Times New Roman"/>
                 <w:noProof/>
                 <w:webHidden/>
               </w:rPr>
             </w:r>
             <w:r>
               <w:rPr>
+                <w:rFonts w:ascii="Times New Roman" w:hAnsi="Times New Roman" w:cs="Times New Roman"/>
                 <w:noProof/>
                 <w:webHidden/>
               </w:rPr>
@@ -723,6 +764,7 @@
             </w:r>
             <w:r>
               <w:rPr>
+                <w:rFonts w:ascii="Times New Roman" w:hAnsi="Times New Roman" w:cs="Times New Roman"/>
                 <w:noProof/>
                 <w:webHidden/>
               </w:rPr>
@@ -730,6 +772,7 @@
             </w:r>
             <w:r>
               <w:rPr>
+                <w:rFonts w:ascii="Times New Roman" w:hAnsi="Times New Roman" w:cs="Times New Roman"/>
                 <w:noProof/>
                 <w:webHidden/>
               </w:rPr>
@@ -741,7 +784,6 @@
           <w:pPr>
             <w:pStyle w:val="TOC1"/>
             <w:rPr>
-              <w:rFonts w:asciiTheme="minorHAnsi" w:hAnsiTheme="minorHAnsi" w:cstheme="minorBidi"/>
               <w:b w:val="0"/>
               <w:bCs w:val="0"/>
               <w:kern w:val="2"/>
@@ -758,7 +800,6 @@
             </w:r>
             <w:r>
               <w:rPr>
-                <w:rFonts w:asciiTheme="minorHAnsi" w:hAnsiTheme="minorHAnsi" w:cstheme="minorBidi"/>
                 <w:b w:val="0"/>
                 <w:bCs w:val="0"/>
                 <w:kern w:val="2"/>
@@ -824,6 +865,7 @@
               <w:tab w:val="right" w:leader="dot" w:pos="9926"/>
             </w:tabs>
             <w:rPr>
+              <w:rFonts w:ascii="Times New Roman" w:hAnsi="Times New Roman" w:cs="Times New Roman"/>
               <w:noProof/>
               <w:kern w:val="2"/>
               <w:sz w:val="24"/>
@@ -836,12 +878,14 @@
             <w:r>
               <w:rPr>
                 <w:rStyle w:val="Hyperlink"/>
+                <w:rFonts w:ascii="Times New Roman" w:hAnsi="Times New Roman" w:cs="Times New Roman"/>
                 <w:noProof/>
               </w:rPr>
               <w:t>2.1.</w:t>
             </w:r>
             <w:r>
               <w:rPr>
+                <w:rFonts w:ascii="Times New Roman" w:hAnsi="Times New Roman" w:cs="Times New Roman"/>
                 <w:noProof/>
                 <w:kern w:val="2"/>
                 <w:sz w:val="24"/>
@@ -854,6 +898,7 @@
             <w:r>
               <w:rPr>
                 <w:rStyle w:val="Hyperlink"/>
+                <w:rFonts w:ascii="Times New Roman" w:hAnsi="Times New Roman" w:cs="Times New Roman"/>
                 <w:noProof/>
               </w:rPr>
               <w:t xml:space="preserve">STEP 5 — Xây dựng Entity Student &amp; </w:t>
@@ -871,12 +916,14 @@
             <w:r>
               <w:rPr>
                 <w:rStyle w:val="Hyperlink"/>
+                <w:rFonts w:ascii="Times New Roman" w:hAnsi="Times New Roman" w:cs="Times New Roman"/>
                 <w:noProof/>
               </w:rPr>
               <w:t xml:space="preserve"> Validation (TODO 1, 2, 3, 18)</w:t>
             </w:r>
             <w:r>
               <w:rPr>
+                <w:rFonts w:ascii="Times New Roman" w:hAnsi="Times New Roman" w:cs="Times New Roman"/>
                 <w:noProof/>
                 <w:webHidden/>
               </w:rPr>
@@ -884,6 +931,7 @@
             </w:r>
             <w:r>
               <w:rPr>
+                <w:rFonts w:ascii="Times New Roman" w:hAnsi="Times New Roman" w:cs="Times New Roman"/>
                 <w:noProof/>
                 <w:webHidden/>
               </w:rPr>
@@ -891,6 +939,7 @@
             </w:r>
             <w:r>
               <w:rPr>
+                <w:rFonts w:ascii="Times New Roman" w:hAnsi="Times New Roman" w:cs="Times New Roman"/>
                 <w:noProof/>
                 <w:webHidden/>
               </w:rPr>
@@ -898,12 +947,14 @@
             </w:r>
             <w:r>
               <w:rPr>
+                <w:rFonts w:ascii="Times New Roman" w:hAnsi="Times New Roman" w:cs="Times New Roman"/>
                 <w:noProof/>
                 <w:webHidden/>
               </w:rPr>
             </w:r>
             <w:r>
               <w:rPr>
+                <w:rFonts w:ascii="Times New Roman" w:hAnsi="Times New Roman" w:cs="Times New Roman"/>
                 <w:noProof/>
                 <w:webHidden/>
               </w:rPr>
@@ -911,6 +962,7 @@
             </w:r>
             <w:r>
               <w:rPr>
+                <w:rFonts w:ascii="Times New Roman" w:hAnsi="Times New Roman" w:cs="Times New Roman"/>
                 <w:noProof/>
                 <w:webHidden/>
               </w:rPr>
@@ -918,6 +970,7 @@
             </w:r>
             <w:r>
               <w:rPr>
+                <w:rFonts w:ascii="Times New Roman" w:hAnsi="Times New Roman" w:cs="Times New Roman"/>
                 <w:noProof/>
                 <w:webHidden/>
               </w:rPr>
@@ -933,6 +986,7 @@
               <w:tab w:val="right" w:leader="dot" w:pos="9926"/>
             </w:tabs>
             <w:rPr>
+              <w:rFonts w:ascii="Times New Roman" w:hAnsi="Times New Roman" w:cs="Times New Roman"/>
               <w:noProof/>
               <w:kern w:val="2"/>
               <w:sz w:val="24"/>
@@ -945,12 +999,14 @@
             <w:r>
               <w:rPr>
                 <w:rStyle w:val="Hyperlink"/>
+                <w:rFonts w:ascii="Times New Roman" w:hAnsi="Times New Roman" w:cs="Times New Roman"/>
                 <w:noProof/>
               </w:rPr>
               <w:t>2.2.</w:t>
             </w:r>
             <w:r>
               <w:rPr>
+                <w:rFonts w:ascii="Times New Roman" w:hAnsi="Times New Roman" w:cs="Times New Roman"/>
                 <w:noProof/>
                 <w:kern w:val="2"/>
                 <w:sz w:val="24"/>
@@ -963,12 +1019,14 @@
             <w:r>
               <w:rPr>
                 <w:rStyle w:val="Hyperlink"/>
+                <w:rFonts w:ascii="Times New Roman" w:hAnsi="Times New Roman" w:cs="Times New Roman"/>
                 <w:noProof/>
               </w:rPr>
               <w:t>STEP 6 — Xây dựng StudentRepository với Derived Query (TODO 19)</w:t>
             </w:r>
             <w:r>
               <w:rPr>
+                <w:rFonts w:ascii="Times New Roman" w:hAnsi="Times New Roman" w:cs="Times New Roman"/>
                 <w:noProof/>
                 <w:webHidden/>
               </w:rPr>
@@ -976,6 +1034,7 @@
             </w:r>
             <w:r>
               <w:rPr>
+                <w:rFonts w:ascii="Times New Roman" w:hAnsi="Times New Roman" w:cs="Times New Roman"/>
                 <w:noProof/>
                 <w:webHidden/>
               </w:rPr>
@@ -983,6 +1042,7 @@
             </w:r>
             <w:r>
               <w:rPr>
+                <w:rFonts w:ascii="Times New Roman" w:hAnsi="Times New Roman" w:cs="Times New Roman"/>
                 <w:noProof/>
                 <w:webHidden/>
               </w:rPr>
@@ -990,12 +1050,14 @@
             </w:r>
             <w:r>
               <w:rPr>
+                <w:rFonts w:ascii="Times New Roman" w:hAnsi="Times New Roman" w:cs="Times New Roman"/>
                 <w:noProof/>
                 <w:webHidden/>
               </w:rPr>
             </w:r>
             <w:r>
               <w:rPr>
+                <w:rFonts w:ascii="Times New Roman" w:hAnsi="Times New Roman" w:cs="Times New Roman"/>
                 <w:noProof/>
                 <w:webHidden/>
               </w:rPr>
@@ -1003,6 +1065,7 @@
             </w:r>
             <w:r>
               <w:rPr>
+                <w:rFonts w:ascii="Times New Roman" w:hAnsi="Times New Roman" w:cs="Times New Roman"/>
                 <w:noProof/>
                 <w:webHidden/>
               </w:rPr>
@@ -1010,6 +1073,7 @@
             </w:r>
             <w:r>
               <w:rPr>
+                <w:rFonts w:ascii="Times New Roman" w:hAnsi="Times New Roman" w:cs="Times New Roman"/>
                 <w:noProof/>
                 <w:webHidden/>
               </w:rPr>
@@ -1025,6 +1089,7 @@
               <w:tab w:val="right" w:leader="dot" w:pos="9926"/>
             </w:tabs>
             <w:rPr>
+              <w:rFonts w:ascii="Times New Roman" w:hAnsi="Times New Roman" w:cs="Times New Roman"/>
               <w:noProof/>
               <w:kern w:val="2"/>
               <w:sz w:val="24"/>
@@ -1037,12 +1102,14 @@
             <w:r>
               <w:rPr>
                 <w:rStyle w:val="Hyperlink"/>
+                <w:rFonts w:ascii="Times New Roman" w:hAnsi="Times New Roman" w:cs="Times New Roman"/>
                 <w:noProof/>
               </w:rPr>
               <w:t>2.3.</w:t>
             </w:r>
             <w:r>
               <w:rPr>
+                <w:rFonts w:ascii="Times New Roman" w:hAnsi="Times New Roman" w:cs="Times New Roman"/>
                 <w:noProof/>
                 <w:kern w:val="2"/>
                 <w:sz w:val="24"/>
@@ -1055,12 +1122,14 @@
             <w:r>
               <w:rPr>
                 <w:rStyle w:val="Hyperlink"/>
+                <w:rFonts w:ascii="Times New Roman" w:hAnsi="Times New Roman" w:cs="Times New Roman"/>
                 <w:noProof/>
               </w:rPr>
               <w:t>STEP 7 — Cài đặt StudentService &amp; DataInitializer (TODO Cho sẵn)</w:t>
             </w:r>
             <w:r>
               <w:rPr>
+                <w:rFonts w:ascii="Times New Roman" w:hAnsi="Times New Roman" w:cs="Times New Roman"/>
                 <w:noProof/>
                 <w:webHidden/>
               </w:rPr>
@@ -1068,6 +1137,7 @@
             </w:r>
             <w:r>
               <w:rPr>
+                <w:rFonts w:ascii="Times New Roman" w:hAnsi="Times New Roman" w:cs="Times New Roman"/>
                 <w:noProof/>
                 <w:webHidden/>
               </w:rPr>
@@ -1075,6 +1145,7 @@
             </w:r>
             <w:r>
               <w:rPr>
+                <w:rFonts w:ascii="Times New Roman" w:hAnsi="Times New Roman" w:cs="Times New Roman"/>
                 <w:noProof/>
                 <w:webHidden/>
               </w:rPr>
@@ -1082,12 +1153,14 @@
             </w:r>
             <w:r>
               <w:rPr>
+                <w:rFonts w:ascii="Times New Roman" w:hAnsi="Times New Roman" w:cs="Times New Roman"/>
                 <w:noProof/>
                 <w:webHidden/>
               </w:rPr>
             </w:r>
             <w:r>
               <w:rPr>
+                <w:rFonts w:ascii="Times New Roman" w:hAnsi="Times New Roman" w:cs="Times New Roman"/>
                 <w:noProof/>
                 <w:webHidden/>
               </w:rPr>
@@ -1095,6 +1168,7 @@
             </w:r>
             <w:r>
               <w:rPr>
+                <w:rFonts w:ascii="Times New Roman" w:hAnsi="Times New Roman" w:cs="Times New Roman"/>
                 <w:noProof/>
                 <w:webHidden/>
               </w:rPr>
@@ -1102,6 +1176,7 @@
             </w:r>
             <w:r>
               <w:rPr>
+                <w:rFonts w:ascii="Times New Roman" w:hAnsi="Times New Roman" w:cs="Times New Roman"/>
                 <w:noProof/>
                 <w:webHidden/>
               </w:rPr>
@@ -1113,7 +1188,6 @@
           <w:pPr>
             <w:pStyle w:val="TOC1"/>
             <w:rPr>
-              <w:rFonts w:asciiTheme="minorHAnsi" w:hAnsiTheme="minorHAnsi" w:cstheme="minorBidi"/>
               <w:b w:val="0"/>
               <w:bCs w:val="0"/>
               <w:kern w:val="2"/>
@@ -1130,7 +1204,6 @@
             </w:r>
             <w:r>
               <w:rPr>
-                <w:rFonts w:asciiTheme="minorHAnsi" w:hAnsiTheme="minorHAnsi" w:cstheme="minorBidi"/>
                 <w:b w:val="0"/>
                 <w:bCs w:val="0"/>
                 <w:kern w:val="2"/>
@@ -1196,6 +1269,7 @@
               <w:tab w:val="right" w:leader="dot" w:pos="9926"/>
             </w:tabs>
             <w:rPr>
+              <w:rFonts w:ascii="Times New Roman" w:hAnsi="Times New Roman" w:cs="Times New Roman"/>
               <w:noProof/>
               <w:kern w:val="2"/>
               <w:sz w:val="24"/>
@@ -1208,12 +1282,14 @@
             <w:r>
               <w:rPr>
                 <w:rStyle w:val="Hyperlink"/>
+                <w:rFonts w:ascii="Times New Roman" w:hAnsi="Times New Roman" w:cs="Times New Roman"/>
                 <w:noProof/>
               </w:rPr>
               <w:t>3.1.</w:t>
             </w:r>
             <w:r>
               <w:rPr>
+                <w:rFonts w:ascii="Times New Roman" w:hAnsi="Times New Roman" w:cs="Times New Roman"/>
                 <w:noProof/>
                 <w:kern w:val="2"/>
                 <w:sz w:val="24"/>
@@ -1226,12 +1302,14 @@
             <w:r>
               <w:rPr>
                 <w:rStyle w:val="Hyperlink"/>
+                <w:rFonts w:ascii="Times New Roman" w:hAnsi="Times New Roman" w:cs="Times New Roman"/>
                 <w:noProof/>
               </w:rPr>
               <w:t>STEP 8 — Xây dựng Controller điều hướng &amp; CRUD (TODO 4 – 7)</w:t>
             </w:r>
             <w:r>
               <w:rPr>
+                <w:rFonts w:ascii="Times New Roman" w:hAnsi="Times New Roman" w:cs="Times New Roman"/>
                 <w:noProof/>
                 <w:webHidden/>
               </w:rPr>
@@ -1239,6 +1317,7 @@
             </w:r>
             <w:r>
               <w:rPr>
+                <w:rFonts w:ascii="Times New Roman" w:hAnsi="Times New Roman" w:cs="Times New Roman"/>
                 <w:noProof/>
                 <w:webHidden/>
               </w:rPr>
@@ -1246,6 +1325,7 @@
             </w:r>
             <w:r>
               <w:rPr>
+                <w:rFonts w:ascii="Times New Roman" w:hAnsi="Times New Roman" w:cs="Times New Roman"/>
                 <w:noProof/>
                 <w:webHidden/>
               </w:rPr>
@@ -1253,12 +1333,14 @@
             </w:r>
             <w:r>
               <w:rPr>
+                <w:rFonts w:ascii="Times New Roman" w:hAnsi="Times New Roman" w:cs="Times New Roman"/>
                 <w:noProof/>
                 <w:webHidden/>
               </w:rPr>
             </w:r>
             <w:r>
               <w:rPr>
+                <w:rFonts w:ascii="Times New Roman" w:hAnsi="Times New Roman" w:cs="Times New Roman"/>
                 <w:noProof/>
                 <w:webHidden/>
               </w:rPr>
@@ -1266,6 +1348,7 @@
             </w:r>
             <w:r>
               <w:rPr>
+                <w:rFonts w:ascii="Times New Roman" w:hAnsi="Times New Roman" w:cs="Times New Roman"/>
                 <w:noProof/>
                 <w:webHidden/>
               </w:rPr>
@@ -1273,6 +1356,7 @@
             </w:r>
             <w:r>
               <w:rPr>
+                <w:rFonts w:ascii="Times New Roman" w:hAnsi="Times New Roman" w:cs="Times New Roman"/>
                 <w:noProof/>
                 <w:webHidden/>
               </w:rPr>
@@ -1288,6 +1372,7 @@
               <w:tab w:val="right" w:leader="dot" w:pos="9926"/>
             </w:tabs>
             <w:rPr>
+              <w:rFonts w:ascii="Times New Roman" w:hAnsi="Times New Roman" w:cs="Times New Roman"/>
               <w:noProof/>
               <w:kern w:val="2"/>
               <w:sz w:val="24"/>
@@ -1300,12 +1385,14 @@
             <w:r>
               <w:rPr>
                 <w:rStyle w:val="Hyperlink"/>
+                <w:rFonts w:ascii="Times New Roman" w:hAnsi="Times New Roman" w:cs="Times New Roman"/>
                 <w:noProof/>
               </w:rPr>
               <w:t>3.2.</w:t>
             </w:r>
             <w:r>
               <w:rPr>
+                <w:rFonts w:ascii="Times New Roman" w:hAnsi="Times New Roman" w:cs="Times New Roman"/>
                 <w:noProof/>
                 <w:kern w:val="2"/>
                 <w:sz w:val="24"/>
@@ -1318,12 +1405,14 @@
             <w:r>
               <w:rPr>
                 <w:rStyle w:val="Hyperlink"/>
+                <w:rFonts w:ascii="Times New Roman" w:hAnsi="Times New Roman" w:cs="Times New Roman"/>
                 <w:noProof/>
               </w:rPr>
               <w:t>STEP 9 — Xây dựng Layout Template chung (TODO 8)</w:t>
             </w:r>
             <w:r>
               <w:rPr>
+                <w:rFonts w:ascii="Times New Roman" w:hAnsi="Times New Roman" w:cs="Times New Roman"/>
                 <w:noProof/>
                 <w:webHidden/>
               </w:rPr>
@@ -1331,6 +1420,7 @@
             </w:r>
             <w:r>
               <w:rPr>
+                <w:rFonts w:ascii="Times New Roman" w:hAnsi="Times New Roman" w:cs="Times New Roman"/>
                 <w:noProof/>
                 <w:webHidden/>
               </w:rPr>
@@ -1338,6 +1428,7 @@
             </w:r>
             <w:r>
               <w:rPr>
+                <w:rFonts w:ascii="Times New Roman" w:hAnsi="Times New Roman" w:cs="Times New Roman"/>
                 <w:noProof/>
                 <w:webHidden/>
               </w:rPr>
@@ -1345,12 +1436,14 @@
             </w:r>
             <w:r>
               <w:rPr>
+                <w:rFonts w:ascii="Times New Roman" w:hAnsi="Times New Roman" w:cs="Times New Roman"/>
                 <w:noProof/>
                 <w:webHidden/>
               </w:rPr>
             </w:r>
             <w:r>
               <w:rPr>
+                <w:rFonts w:ascii="Times New Roman" w:hAnsi="Times New Roman" w:cs="Times New Roman"/>
                 <w:noProof/>
                 <w:webHidden/>
               </w:rPr>
@@ -1358,6 +1451,7 @@
             </w:r>
             <w:r>
               <w:rPr>
+                <w:rFonts w:ascii="Times New Roman" w:hAnsi="Times New Roman" w:cs="Times New Roman"/>
                 <w:noProof/>
                 <w:webHidden/>
               </w:rPr>
@@ -1365,6 +1459,7 @@
             </w:r>
             <w:r>
               <w:rPr>
+                <w:rFonts w:ascii="Times New Roman" w:hAnsi="Times New Roman" w:cs="Times New Roman"/>
                 <w:noProof/>
                 <w:webHidden/>
               </w:rPr>
@@ -1380,6 +1475,7 @@
               <w:tab w:val="right" w:leader="dot" w:pos="9926"/>
             </w:tabs>
             <w:rPr>
+              <w:rFonts w:ascii="Times New Roman" w:hAnsi="Times New Roman" w:cs="Times New Roman"/>
               <w:noProof/>
               <w:kern w:val="2"/>
               <w:sz w:val="24"/>
@@ -1392,12 +1488,14 @@
             <w:r>
               <w:rPr>
                 <w:rStyle w:val="Hyperlink"/>
+                <w:rFonts w:ascii="Times New Roman" w:hAnsi="Times New Roman" w:cs="Times New Roman"/>
                 <w:noProof/>
               </w:rPr>
               <w:t>3.3.</w:t>
             </w:r>
             <w:r>
               <w:rPr>
+                <w:rFonts w:ascii="Times New Roman" w:hAnsi="Times New Roman" w:cs="Times New Roman"/>
                 <w:noProof/>
                 <w:kern w:val="2"/>
                 <w:sz w:val="24"/>
@@ -1410,12 +1508,14 @@
             <w:r>
               <w:rPr>
                 <w:rStyle w:val="Hyperlink"/>
+                <w:rFonts w:ascii="Times New Roman" w:hAnsi="Times New Roman" w:cs="Times New Roman"/>
                 <w:noProof/>
               </w:rPr>
               <w:t>STEP 10 — Xây dựng Trang danh sách sinh viên (TODO 9 – 13)</w:t>
             </w:r>
             <w:r>
               <w:rPr>
+                <w:rFonts w:ascii="Times New Roman" w:hAnsi="Times New Roman" w:cs="Times New Roman"/>
                 <w:noProof/>
                 <w:webHidden/>
               </w:rPr>
@@ -1423,6 +1523,7 @@
             </w:r>
             <w:r>
               <w:rPr>
+                <w:rFonts w:ascii="Times New Roman" w:hAnsi="Times New Roman" w:cs="Times New Roman"/>
                 <w:noProof/>
                 <w:webHidden/>
               </w:rPr>
@@ -1430,6 +1531,7 @@
             </w:r>
             <w:r>
               <w:rPr>
+                <w:rFonts w:ascii="Times New Roman" w:hAnsi="Times New Roman" w:cs="Times New Roman"/>
                 <w:noProof/>
                 <w:webHidden/>
               </w:rPr>
@@ -1437,12 +1539,14 @@
             </w:r>
             <w:r>
               <w:rPr>
+                <w:rFonts w:ascii="Times New Roman" w:hAnsi="Times New Roman" w:cs="Times New Roman"/>
                 <w:noProof/>
                 <w:webHidden/>
               </w:rPr>
             </w:r>
             <w:r>
               <w:rPr>
+                <w:rFonts w:ascii="Times New Roman" w:hAnsi="Times New Roman" w:cs="Times New Roman"/>
                 <w:noProof/>
                 <w:webHidden/>
               </w:rPr>
@@ -1450,6 +1554,7 @@
             </w:r>
             <w:r>
               <w:rPr>
+                <w:rFonts w:ascii="Times New Roman" w:hAnsi="Times New Roman" w:cs="Times New Roman"/>
                 <w:noProof/>
                 <w:webHidden/>
               </w:rPr>
@@ -1457,6 +1562,7 @@
             </w:r>
             <w:r>
               <w:rPr>
+                <w:rFonts w:ascii="Times New Roman" w:hAnsi="Times New Roman" w:cs="Times New Roman"/>
                 <w:noProof/>
                 <w:webHidden/>
               </w:rPr>
@@ -1472,6 +1578,7 @@
               <w:tab w:val="right" w:leader="dot" w:pos="9926"/>
             </w:tabs>
             <w:rPr>
+              <w:rFonts w:ascii="Times New Roman" w:hAnsi="Times New Roman" w:cs="Times New Roman"/>
               <w:noProof/>
               <w:kern w:val="2"/>
               <w:sz w:val="24"/>
@@ -1484,12 +1591,14 @@
             <w:r>
               <w:rPr>
                 <w:rStyle w:val="Hyperlink"/>
+                <w:rFonts w:ascii="Times New Roman" w:hAnsi="Times New Roman" w:cs="Times New Roman"/>
                 <w:noProof/>
               </w:rPr>
               <w:t>3.4.</w:t>
             </w:r>
             <w:r>
               <w:rPr>
+                <w:rFonts w:ascii="Times New Roman" w:hAnsi="Times New Roman" w:cs="Times New Roman"/>
                 <w:noProof/>
                 <w:kern w:val="2"/>
                 <w:sz w:val="24"/>
@@ -1502,12 +1611,14 @@
             <w:r>
               <w:rPr>
                 <w:rStyle w:val="Hyperlink"/>
+                <w:rFonts w:ascii="Times New Roman" w:hAnsi="Times New Roman" w:cs="Times New Roman"/>
                 <w:noProof/>
               </w:rPr>
               <w:t>STEP 11 — Xây dựng Trang chi tiết sinh viên (TODO 14)</w:t>
             </w:r>
             <w:r>
               <w:rPr>
+                <w:rFonts w:ascii="Times New Roman" w:hAnsi="Times New Roman" w:cs="Times New Roman"/>
                 <w:noProof/>
                 <w:webHidden/>
               </w:rPr>
@@ -1515,6 +1626,7 @@
             </w:r>
             <w:r>
               <w:rPr>
+                <w:rFonts w:ascii="Times New Roman" w:hAnsi="Times New Roman" w:cs="Times New Roman"/>
                 <w:noProof/>
                 <w:webHidden/>
               </w:rPr>
@@ -1522,6 +1634,7 @@
             </w:r>
             <w:r>
               <w:rPr>
+                <w:rFonts w:ascii="Times New Roman" w:hAnsi="Times New Roman" w:cs="Times New Roman"/>
                 <w:noProof/>
                 <w:webHidden/>
               </w:rPr>
@@ -1529,12 +1642,14 @@
             </w:r>
             <w:r>
               <w:rPr>
+                <w:rFonts w:ascii="Times New Roman" w:hAnsi="Times New Roman" w:cs="Times New Roman"/>
                 <w:noProof/>
                 <w:webHidden/>
               </w:rPr>
             </w:r>
             <w:r>
               <w:rPr>
+                <w:rFonts w:ascii="Times New Roman" w:hAnsi="Times New Roman" w:cs="Times New Roman"/>
                 <w:noProof/>
                 <w:webHidden/>
               </w:rPr>
@@ -1542,6 +1657,7 @@
             </w:r>
             <w:r>
               <w:rPr>
+                <w:rFonts w:ascii="Times New Roman" w:hAnsi="Times New Roman" w:cs="Times New Roman"/>
                 <w:noProof/>
                 <w:webHidden/>
               </w:rPr>
@@ -1549,6 +1665,7 @@
             </w:r>
             <w:r>
               <w:rPr>
+                <w:rFonts w:ascii="Times New Roman" w:hAnsi="Times New Roman" w:cs="Times New Roman"/>
                 <w:noProof/>
                 <w:webHidden/>
               </w:rPr>
@@ -1564,6 +1681,7 @@
               <w:tab w:val="right" w:leader="dot" w:pos="9926"/>
             </w:tabs>
             <w:rPr>
+              <w:rFonts w:ascii="Times New Roman" w:hAnsi="Times New Roman" w:cs="Times New Roman"/>
               <w:noProof/>
               <w:kern w:val="2"/>
               <w:sz w:val="24"/>
@@ -1576,12 +1694,14 @@
             <w:r>
               <w:rPr>
                 <w:rStyle w:val="Hyperlink"/>
+                <w:rFonts w:ascii="Times New Roman" w:hAnsi="Times New Roman" w:cs="Times New Roman"/>
                 <w:noProof/>
               </w:rPr>
               <w:t>3.5.</w:t>
             </w:r>
             <w:r>
               <w:rPr>
+                <w:rFonts w:ascii="Times New Roman" w:hAnsi="Times New Roman" w:cs="Times New Roman"/>
                 <w:noProof/>
                 <w:kern w:val="2"/>
                 <w:sz w:val="24"/>
@@ -1594,26 +1714,14 @@
             <w:r>
               <w:rPr>
                 <w:rStyle w:val="Hyperlink"/>
+                <w:rFonts w:ascii="Times New Roman" w:hAnsi="Times New Roman" w:cs="Times New Roman"/>
                 <w:noProof/>
               </w:rPr>
-              <w:t>STEP 12</w:t>
+              <w:t>STEP 12 — Xây dựng Form thêm mới / Cập nhật có Validation (TODO 15 – 16)</w:t>
             </w:r>
             <w:r>
               <w:rPr>
-                <w:rStyle w:val="Hyperlink"/>
-                <w:noProof/>
-              </w:rPr>
-              <w:t xml:space="preserve"> </w:t>
-            </w:r>
-            <w:r>
-              <w:rPr>
-                <w:rStyle w:val="Hyperlink"/>
-                <w:noProof/>
-              </w:rPr>
-              <w:t>— Xây dựng Form thêm mới / Cập nhật có Validation (TODO 15 – 16)</w:t>
-            </w:r>
-            <w:r>
-              <w:rPr>
+                <w:rFonts w:ascii="Times New Roman" w:hAnsi="Times New Roman" w:cs="Times New Roman"/>
                 <w:noProof/>
                 <w:webHidden/>
               </w:rPr>
@@ -1621,6 +1729,7 @@
             </w:r>
             <w:r>
               <w:rPr>
+                <w:rFonts w:ascii="Times New Roman" w:hAnsi="Times New Roman" w:cs="Times New Roman"/>
                 <w:noProof/>
                 <w:webHidden/>
               </w:rPr>
@@ -1628,6 +1737,7 @@
             </w:r>
             <w:r>
               <w:rPr>
+                <w:rFonts w:ascii="Times New Roman" w:hAnsi="Times New Roman" w:cs="Times New Roman"/>
                 <w:noProof/>
                 <w:webHidden/>
               </w:rPr>
@@ -1635,12 +1745,14 @@
             </w:r>
             <w:r>
               <w:rPr>
+                <w:rFonts w:ascii="Times New Roman" w:hAnsi="Times New Roman" w:cs="Times New Roman"/>
                 <w:noProof/>
                 <w:webHidden/>
               </w:rPr>
             </w:r>
             <w:r>
               <w:rPr>
+                <w:rFonts w:ascii="Times New Roman" w:hAnsi="Times New Roman" w:cs="Times New Roman"/>
                 <w:noProof/>
                 <w:webHidden/>
               </w:rPr>
@@ -1648,6 +1760,7 @@
             </w:r>
             <w:r>
               <w:rPr>
+                <w:rFonts w:ascii="Times New Roman" w:hAnsi="Times New Roman" w:cs="Times New Roman"/>
                 <w:noProof/>
                 <w:webHidden/>
               </w:rPr>
@@ -1655,6 +1768,7 @@
             </w:r>
             <w:r>
               <w:rPr>
+                <w:rFonts w:ascii="Times New Roman" w:hAnsi="Times New Roman" w:cs="Times New Roman"/>
                 <w:noProof/>
                 <w:webHidden/>
               </w:rPr>
@@ -1666,7 +1780,6 @@
           <w:pPr>
             <w:pStyle w:val="TOC1"/>
             <w:rPr>
-              <w:rFonts w:asciiTheme="minorHAnsi" w:hAnsiTheme="minorHAnsi" w:cstheme="minorBidi"/>
               <w:b w:val="0"/>
               <w:bCs w:val="0"/>
               <w:kern w:val="2"/>
@@ -1683,7 +1796,6 @@
             </w:r>
             <w:r>
               <w:rPr>
-                <w:rFonts w:asciiTheme="minorHAnsi" w:hAnsiTheme="minorHAnsi" w:cstheme="minorBidi"/>
                 <w:b w:val="0"/>
                 <w:bCs w:val="0"/>
                 <w:kern w:val="2"/>
@@ -1749,6 +1861,7 @@
               <w:tab w:val="right" w:leader="dot" w:pos="9926"/>
             </w:tabs>
             <w:rPr>
+              <w:rFonts w:ascii="Times New Roman" w:hAnsi="Times New Roman" w:cs="Times New Roman"/>
               <w:noProof/>
               <w:kern w:val="2"/>
               <w:sz w:val="24"/>
@@ -1761,12 +1874,14 @@
             <w:r>
               <w:rPr>
                 <w:rStyle w:val="Hyperlink"/>
+                <w:rFonts w:ascii="Times New Roman" w:hAnsi="Times New Roman" w:cs="Times New Roman"/>
                 <w:noProof/>
               </w:rPr>
               <w:t>4.1.</w:t>
             </w:r>
             <w:r>
               <w:rPr>
+                <w:rFonts w:ascii="Times New Roman" w:hAnsi="Times New Roman" w:cs="Times New Roman"/>
                 <w:noProof/>
                 <w:kern w:val="2"/>
                 <w:sz w:val="24"/>
@@ -1779,12 +1894,14 @@
             <w:r>
               <w:rPr>
                 <w:rStyle w:val="Hyperlink"/>
+                <w:rFonts w:ascii="Times New Roman" w:hAnsi="Times New Roman" w:cs="Times New Roman"/>
                 <w:noProof/>
               </w:rPr>
               <w:t>STEP 13 — Chạy ứng dụng, Kiểm thử Offline &amp; Git Log</w:t>
             </w:r>
             <w:r>
               <w:rPr>
+                <w:rFonts w:ascii="Times New Roman" w:hAnsi="Times New Roman" w:cs="Times New Roman"/>
                 <w:noProof/>
                 <w:webHidden/>
               </w:rPr>
@@ -1792,6 +1909,7 @@
             </w:r>
             <w:r>
               <w:rPr>
+                <w:rFonts w:ascii="Times New Roman" w:hAnsi="Times New Roman" w:cs="Times New Roman"/>
                 <w:noProof/>
                 <w:webHidden/>
               </w:rPr>
@@ -1799,6 +1917,7 @@
             </w:r>
             <w:r>
               <w:rPr>
+                <w:rFonts w:ascii="Times New Roman" w:hAnsi="Times New Roman" w:cs="Times New Roman"/>
                 <w:noProof/>
                 <w:webHidden/>
               </w:rPr>
@@ -1806,12 +1925,14 @@
             </w:r>
             <w:r>
               <w:rPr>
+                <w:rFonts w:ascii="Times New Roman" w:hAnsi="Times New Roman" w:cs="Times New Roman"/>
                 <w:noProof/>
                 <w:webHidden/>
               </w:rPr>
             </w:r>
             <w:r>
               <w:rPr>
+                <w:rFonts w:ascii="Times New Roman" w:hAnsi="Times New Roman" w:cs="Times New Roman"/>
                 <w:noProof/>
                 <w:webHidden/>
               </w:rPr>
@@ -1819,6 +1940,7 @@
             </w:r>
             <w:r>
               <w:rPr>
+                <w:rFonts w:ascii="Times New Roman" w:hAnsi="Times New Roman" w:cs="Times New Roman"/>
                 <w:noProof/>
                 <w:webHidden/>
               </w:rPr>
@@ -1826,6 +1948,7 @@
             </w:r>
             <w:r>
               <w:rPr>
+                <w:rFonts w:ascii="Times New Roman" w:hAnsi="Times New Roman" w:cs="Times New Roman"/>
                 <w:noProof/>
                 <w:webHidden/>
               </w:rPr>
@@ -1837,7 +1960,6 @@
           <w:pPr>
             <w:pStyle w:val="TOC1"/>
             <w:rPr>
-              <w:rFonts w:asciiTheme="minorHAnsi" w:hAnsiTheme="minorHAnsi" w:cstheme="minorBidi"/>
               <w:b w:val="0"/>
               <w:bCs w:val="0"/>
               <w:kern w:val="2"/>
@@ -1854,7 +1976,6 @@
             </w:r>
             <w:r>
               <w:rPr>
-                <w:rFonts w:asciiTheme="minorHAnsi" w:hAnsiTheme="minorHAnsi" w:cstheme="minorBidi"/>
                 <w:b w:val="0"/>
                 <w:bCs w:val="0"/>
                 <w:kern w:val="2"/>
@@ -1913,8 +2034,14 @@
           </w:hyperlink>
         </w:p>
         <w:p>
+          <w:pPr>
+            <w:rPr>
+              <w:rFonts w:ascii="Times New Roman" w:hAnsi="Times New Roman" w:cs="Times New Roman"/>
+            </w:rPr>
+          </w:pPr>
           <w:r>
             <w:rPr>
+              <w:rFonts w:ascii="Times New Roman" w:hAnsi="Times New Roman" w:cs="Times New Roman"/>
               <w:b/>
               <w:bCs/>
               <w:noProof/>
@@ -1931,71 +2058,122 @@
           <w:ilvl w:val="0"/>
           <w:numId w:val="9"/>
         </w:numPr>
+        <w:rPr>
+          <w:rFonts w:cs="Times New Roman"/>
+        </w:rPr>
       </w:pPr>
       <w:bookmarkStart w:id="1" w:name="_Toc243839296"/>
       <w:proofErr w:type="spellStart"/>
       <w:r>
+        <w:rPr>
+          <w:rFonts w:cs="Times New Roman"/>
+        </w:rPr>
         <w:lastRenderedPageBreak/>
         <w:t>Khởi</w:t>
       </w:r>
       <w:proofErr w:type="spellEnd"/>
       <w:r>
-        <w:t xml:space="preserve"> </w:t>
-      </w:r>
-      <w:proofErr w:type="spellStart"/>
-      <w:r>
+        <w:rPr>
+          <w:rFonts w:cs="Times New Roman"/>
+        </w:rPr>
+        <w:t xml:space="preserve"> </w:t>
+      </w:r>
+      <w:proofErr w:type="spellStart"/>
+      <w:r>
+        <w:rPr>
+          <w:rFonts w:cs="Times New Roman"/>
+        </w:rPr>
         <w:t>tạo</w:t>
       </w:r>
       <w:proofErr w:type="spellEnd"/>
       <w:r>
-        <w:t xml:space="preserve"> </w:t>
-      </w:r>
-      <w:proofErr w:type="spellStart"/>
-      <w:r>
+        <w:rPr>
+          <w:rFonts w:cs="Times New Roman"/>
+        </w:rPr>
+        <w:t xml:space="preserve"> </w:t>
+      </w:r>
+      <w:proofErr w:type="spellStart"/>
+      <w:r>
+        <w:rPr>
+          <w:rFonts w:cs="Times New Roman"/>
+        </w:rPr>
         <w:t>dự</w:t>
       </w:r>
       <w:proofErr w:type="spellEnd"/>
       <w:r>
-        <w:t xml:space="preserve"> </w:t>
-      </w:r>
-      <w:proofErr w:type="spellStart"/>
-      <w:r>
+        <w:rPr>
+          <w:rFonts w:cs="Times New Roman"/>
+        </w:rPr>
+        <w:t xml:space="preserve"> </w:t>
+      </w:r>
+      <w:proofErr w:type="spellStart"/>
+      <w:r>
+        <w:rPr>
+          <w:rFonts w:cs="Times New Roman"/>
+        </w:rPr>
         <w:t>án</w:t>
       </w:r>
       <w:proofErr w:type="spellEnd"/>
       <w:r>
+        <w:rPr>
+          <w:rFonts w:cs="Times New Roman"/>
+        </w:rPr>
         <w:t xml:space="preserve"> &amp; </w:t>
       </w:r>
       <w:proofErr w:type="spellStart"/>
       <w:r>
+        <w:rPr>
+          <w:rFonts w:cs="Times New Roman"/>
+        </w:rPr>
         <w:t>Cấu</w:t>
       </w:r>
       <w:proofErr w:type="spellEnd"/>
       <w:r>
-        <w:t xml:space="preserve"> </w:t>
-      </w:r>
-      <w:proofErr w:type="spellStart"/>
-      <w:r>
+        <w:rPr>
+          <w:rFonts w:cs="Times New Roman"/>
+        </w:rPr>
+        <w:t xml:space="preserve"> </w:t>
+      </w:r>
+      <w:proofErr w:type="spellStart"/>
+      <w:r>
+        <w:rPr>
+          <w:rFonts w:cs="Times New Roman"/>
+        </w:rPr>
         <w:t>hình</w:t>
       </w:r>
       <w:proofErr w:type="spellEnd"/>
       <w:r>
-        <w:t xml:space="preserve"> </w:t>
-      </w:r>
-      <w:proofErr w:type="spellStart"/>
-      <w:r>
+        <w:rPr>
+          <w:rFonts w:cs="Times New Roman"/>
+        </w:rPr>
+        <w:t xml:space="preserve"> </w:t>
+      </w:r>
+      <w:proofErr w:type="spellStart"/>
+      <w:r>
+        <w:rPr>
+          <w:rFonts w:cs="Times New Roman"/>
+        </w:rPr>
         <w:t>môi</w:t>
       </w:r>
       <w:proofErr w:type="spellEnd"/>
       <w:r>
-        <w:t xml:space="preserve"> </w:t>
-      </w:r>
-      <w:proofErr w:type="spellStart"/>
-      <w:r>
+        <w:rPr>
+          <w:rFonts w:cs="Times New Roman"/>
+        </w:rPr>
+        <w:t xml:space="preserve"> </w:t>
+      </w:r>
+      <w:proofErr w:type="spellStart"/>
+      <w:r>
+        <w:rPr>
+          <w:rFonts w:cs="Times New Roman"/>
+        </w:rPr>
         <w:t>trường</w:t>
       </w:r>
       <w:proofErr w:type="spellEnd"/>
       <w:r>
+        <w:rPr>
+          <w:rFonts w:cs="Times New Roman"/>
+        </w:rPr>
         <w:t xml:space="preserve"> (STEP 1 – 4)</w:t>
       </w:r>
       <w:bookmarkEnd w:id="1"/>
@@ -2005,6 +2183,7 @@
         <w:pStyle w:val="Heading2"/>
         <w:spacing w:before="240" w:after="60"/>
         <w:rPr>
+          <w:rFonts w:cs="Times New Roman"/>
           <w:color w:val="auto"/>
           <w:szCs w:val="24"/>
         </w:rPr>
@@ -2079,6 +2258,7 @@
         <w:spacing w:after="80"/>
         <w:jc w:val="both"/>
         <w:rPr>
+          <w:rFonts w:ascii="Times New Roman" w:hAnsi="Times New Roman" w:cs="Times New Roman"/>
           <w:sz w:val="24"/>
           <w:szCs w:val="24"/>
         </w:rPr>
@@ -2449,6 +2629,7 @@
         <w:spacing w:after="80"/>
         <w:jc w:val="both"/>
         <w:rPr>
+          <w:rFonts w:ascii="Times New Roman" w:hAnsi="Times New Roman" w:cs="Times New Roman"/>
           <w:sz w:val="24"/>
           <w:szCs w:val="24"/>
         </w:rPr>
@@ -2508,12 +2689,15 @@
         <w:spacing w:before="120" w:after="40"/>
         <w:jc w:val="center"/>
         <w:rPr>
+          <w:rFonts w:ascii="Times New Roman" w:hAnsi="Times New Roman" w:cs="Times New Roman"/>
           <w:sz w:val="24"/>
           <w:szCs w:val="24"/>
         </w:rPr>
       </w:pPr>
       <w:r>
         <w:rPr>
+          <w:rFonts w:ascii="Times New Roman" w:hAnsi="Times New Roman" w:cs="Times New Roman"/>
+          <w:noProof/>
           <w:sz w:val="24"/>
           <w:szCs w:val="24"/>
         </w:rPr>
@@ -2559,12 +2743,15 @@
         <w:spacing w:before="120" w:after="40"/>
         <w:jc w:val="center"/>
         <w:rPr>
+          <w:rFonts w:ascii="Times New Roman" w:hAnsi="Times New Roman" w:cs="Times New Roman"/>
           <w:sz w:val="24"/>
           <w:szCs w:val="24"/>
         </w:rPr>
       </w:pPr>
       <w:r>
         <w:rPr>
+          <w:rFonts w:ascii="Times New Roman" w:hAnsi="Times New Roman" w:cs="Times New Roman"/>
+          <w:noProof/>
           <w:sz w:val="24"/>
           <w:szCs w:val="24"/>
         </w:rPr>
@@ -2611,6 +2798,7 @@
         <w:spacing w:after="120"/>
         <w:jc w:val="center"/>
         <w:rPr>
+          <w:rFonts w:ascii="Times New Roman" w:hAnsi="Times New Roman" w:cs="Times New Roman"/>
           <w:sz w:val="24"/>
           <w:szCs w:val="24"/>
         </w:rPr>
@@ -2841,6 +3029,7 @@
         <w:spacing w:after="80"/>
         <w:jc w:val="both"/>
         <w:rPr>
+          <w:rFonts w:ascii="Times New Roman" w:hAnsi="Times New Roman" w:cs="Times New Roman"/>
           <w:sz w:val="24"/>
           <w:szCs w:val="24"/>
         </w:rPr>
@@ -2860,6 +3049,7 @@
         <w:spacing w:after="40"/>
         <w:ind w:left="360"/>
         <w:rPr>
+          <w:rFonts w:ascii="Times New Roman" w:hAnsi="Times New Roman" w:cs="Times New Roman"/>
           <w:sz w:val="24"/>
           <w:szCs w:val="24"/>
         </w:rPr>
@@ -2875,7 +3065,7 @@
       </w:r>
       <w:r>
         <w:rPr>
-          <w:rFonts w:ascii="Consolas" w:hAnsi="Consolas" w:cs="Consolas"/>
+          <w:rFonts w:ascii="Times New Roman" w:hAnsi="Times New Roman" w:cs="Times New Roman"/>
           <w:sz w:val="24"/>
           <w:szCs w:val="24"/>
         </w:rPr>
@@ -2884,7 +3074,7 @@
       <w:proofErr w:type="spellStart"/>
       <w:r>
         <w:rPr>
-          <w:rFonts w:ascii="Consolas" w:hAnsi="Consolas" w:cs="Consolas"/>
+          <w:rFonts w:ascii="Times New Roman" w:hAnsi="Times New Roman" w:cs="Times New Roman"/>
           <w:sz w:val="24"/>
           <w:szCs w:val="24"/>
         </w:rPr>
@@ -2893,7 +3083,7 @@
       <w:proofErr w:type="spellEnd"/>
       <w:r>
         <w:rPr>
-          <w:rFonts w:ascii="Consolas" w:hAnsi="Consolas" w:cs="Consolas"/>
+          <w:rFonts w:ascii="Times New Roman" w:hAnsi="Times New Roman" w:cs="Times New Roman"/>
           <w:sz w:val="24"/>
           <w:szCs w:val="24"/>
         </w:rPr>
@@ -2905,6 +3095,7 @@
         <w:spacing w:after="80"/>
         <w:jc w:val="both"/>
         <w:rPr>
+          <w:rFonts w:ascii="Times New Roman" w:hAnsi="Times New Roman" w:cs="Times New Roman"/>
           <w:sz w:val="24"/>
           <w:szCs w:val="24"/>
         </w:rPr>
@@ -2924,13 +3115,14 @@
         <w:spacing w:after="40"/>
         <w:ind w:left="360"/>
         <w:rPr>
+          <w:rFonts w:ascii="Times New Roman" w:hAnsi="Times New Roman" w:cs="Times New Roman"/>
           <w:sz w:val="24"/>
           <w:szCs w:val="24"/>
         </w:rPr>
       </w:pPr>
       <w:r>
         <w:rPr>
-          <w:rFonts w:ascii="Consolas" w:hAnsi="Consolas" w:cs="Consolas"/>
+          <w:rFonts w:ascii="Times New Roman" w:hAnsi="Times New Roman" w:cs="Times New Roman"/>
           <w:b/>
           <w:sz w:val="24"/>
           <w:szCs w:val="24"/>
@@ -3059,13 +3251,14 @@
         <w:spacing w:after="40"/>
         <w:ind w:left="360"/>
         <w:rPr>
+          <w:rFonts w:ascii="Times New Roman" w:hAnsi="Times New Roman" w:cs="Times New Roman"/>
           <w:sz w:val="24"/>
           <w:szCs w:val="24"/>
         </w:rPr>
       </w:pPr>
       <w:r>
         <w:rPr>
-          <w:rFonts w:ascii="Consolas" w:hAnsi="Consolas" w:cs="Consolas"/>
+          <w:rFonts w:ascii="Times New Roman" w:hAnsi="Times New Roman" w:cs="Times New Roman"/>
           <w:b/>
           <w:sz w:val="24"/>
           <w:szCs w:val="24"/>
@@ -3266,13 +3459,14 @@
         <w:spacing w:after="40"/>
         <w:ind w:left="360"/>
         <w:rPr>
+          <w:rFonts w:ascii="Times New Roman" w:hAnsi="Times New Roman" w:cs="Times New Roman"/>
           <w:sz w:val="24"/>
           <w:szCs w:val="24"/>
         </w:rPr>
       </w:pPr>
       <w:r>
         <w:rPr>
-          <w:rFonts w:ascii="Consolas" w:hAnsi="Consolas" w:cs="Consolas"/>
+          <w:rFonts w:ascii="Times New Roman" w:hAnsi="Times New Roman" w:cs="Times New Roman"/>
           <w:b/>
           <w:sz w:val="24"/>
           <w:szCs w:val="24"/>
@@ -3482,6 +3676,7 @@
       <w:pPr>
         <w:spacing w:after="80"/>
         <w:rPr>
+          <w:rFonts w:ascii="Times New Roman" w:hAnsi="Times New Roman" w:cs="Times New Roman"/>
           <w:sz w:val="24"/>
           <w:szCs w:val="24"/>
         </w:rPr>
@@ -3490,22 +3685,51 @@
     <w:p>
       <w:pPr>
         <w:pStyle w:val="Heading2"/>
+        <w:rPr>
+          <w:rFonts w:cs="Times New Roman"/>
+        </w:rPr>
       </w:pPr>
       <w:bookmarkStart w:id="3" w:name="_Toc243839298"/>
       <w:r>
+        <w:rPr>
+          <w:rFonts w:cs="Times New Roman"/>
+        </w:rPr>
         <w:lastRenderedPageBreak/>
         <w:t xml:space="preserve">STEP 2 — Cài </w:t>
       </w:r>
       <w:proofErr w:type="spellStart"/>
       <w:r>
+        <w:rPr>
+          <w:rFonts w:cs="Times New Roman"/>
+        </w:rPr>
         <w:t>đặt</w:t>
       </w:r>
       <w:proofErr w:type="spellEnd"/>
       <w:r>
-        <w:t xml:space="preserve"> Bootstrap 5.3 Offline &amp; CSS Tùy </w:t>
-      </w:r>
-      <w:proofErr w:type="spellStart"/>
-      <w:r>
+        <w:rPr>
+          <w:rFonts w:cs="Times New Roman"/>
+        </w:rPr>
+        <w:t xml:space="preserve"> Bootstrap 5.3 Offline &amp; CSS </w:t>
+      </w:r>
+      <w:proofErr w:type="spellStart"/>
+      <w:r>
+        <w:rPr>
+          <w:rFonts w:cs="Times New Roman"/>
+        </w:rPr>
+        <w:t>Tùy</w:t>
+      </w:r>
+      <w:proofErr w:type="spellEnd"/>
+      <w:r>
+        <w:rPr>
+          <w:rFonts w:cs="Times New Roman"/>
+        </w:rPr>
+        <w:t xml:space="preserve"> </w:t>
+      </w:r>
+      <w:proofErr w:type="spellStart"/>
+      <w:r>
+        <w:rPr>
+          <w:rFonts w:cs="Times New Roman"/>
+        </w:rPr>
         <w:t>chỉnh</w:t>
       </w:r>
       <w:bookmarkEnd w:id="3"/>
@@ -3516,6 +3740,7 @@
         <w:spacing w:after="80"/>
         <w:jc w:val="both"/>
         <w:rPr>
+          <w:rFonts w:ascii="Times New Roman" w:hAnsi="Times New Roman" w:cs="Times New Roman"/>
           <w:sz w:val="24"/>
           <w:szCs w:val="24"/>
         </w:rPr>
@@ -4066,6 +4291,7 @@
         <w:spacing w:after="80"/>
         <w:jc w:val="both"/>
         <w:rPr>
+          <w:rFonts w:ascii="Times New Roman" w:hAnsi="Times New Roman" w:cs="Times New Roman"/>
           <w:sz w:val="24"/>
           <w:szCs w:val="24"/>
         </w:rPr>
@@ -4125,12 +4351,14 @@
         <w:spacing w:before="120" w:after="40"/>
         <w:jc w:val="center"/>
         <w:rPr>
+          <w:rFonts w:ascii="Times New Roman" w:hAnsi="Times New Roman" w:cs="Times New Roman"/>
           <w:sz w:val="24"/>
           <w:szCs w:val="24"/>
         </w:rPr>
       </w:pPr>
       <w:r>
         <w:rPr>
+          <w:rFonts w:ascii="Times New Roman" w:hAnsi="Times New Roman" w:cs="Times New Roman"/>
           <w:noProof/>
           <w:sz w:val="24"/>
           <w:szCs w:val="24"/>
@@ -4179,6 +4407,7 @@
         <w:spacing w:after="120"/>
         <w:jc w:val="center"/>
         <w:rPr>
+          <w:rFonts w:ascii="Times New Roman" w:hAnsi="Times New Roman" w:cs="Times New Roman"/>
           <w:sz w:val="24"/>
           <w:szCs w:val="24"/>
         </w:rPr>
@@ -4389,6 +4618,7 @@
         <w:spacing w:after="80"/>
         <w:jc w:val="both"/>
         <w:rPr>
+          <w:rFonts w:ascii="Times New Roman" w:hAnsi="Times New Roman" w:cs="Times New Roman"/>
           <w:sz w:val="24"/>
           <w:szCs w:val="24"/>
         </w:rPr>
@@ -4408,6 +4638,7 @@
         <w:spacing w:after="40"/>
         <w:ind w:left="360"/>
         <w:rPr>
+          <w:rFonts w:ascii="Times New Roman" w:hAnsi="Times New Roman" w:cs="Times New Roman"/>
           <w:sz w:val="24"/>
           <w:szCs w:val="24"/>
         </w:rPr>
@@ -4423,7 +4654,7 @@
       </w:r>
       <w:r>
         <w:rPr>
-          <w:rFonts w:ascii="Consolas" w:hAnsi="Consolas" w:cs="Consolas"/>
+          <w:rFonts w:ascii="Times New Roman" w:hAnsi="Times New Roman" w:cs="Times New Roman"/>
           <w:sz w:val="24"/>
           <w:szCs w:val="24"/>
         </w:rPr>
@@ -4432,7 +4663,7 @@
       <w:proofErr w:type="spellStart"/>
       <w:r>
         <w:rPr>
-          <w:rFonts w:ascii="Consolas" w:hAnsi="Consolas" w:cs="Consolas"/>
+          <w:rFonts w:ascii="Times New Roman" w:hAnsi="Times New Roman" w:cs="Times New Roman"/>
           <w:sz w:val="24"/>
           <w:szCs w:val="24"/>
         </w:rPr>
@@ -4441,7 +4672,7 @@
       <w:proofErr w:type="spellEnd"/>
       <w:r>
         <w:rPr>
-          <w:rFonts w:ascii="Consolas" w:hAnsi="Consolas" w:cs="Consolas"/>
+          <w:rFonts w:ascii="Times New Roman" w:hAnsi="Times New Roman" w:cs="Times New Roman"/>
           <w:sz w:val="24"/>
           <w:szCs w:val="24"/>
         </w:rPr>
@@ -4453,6 +4684,7 @@
         <w:spacing w:after="80"/>
         <w:jc w:val="both"/>
         <w:rPr>
+          <w:rFonts w:ascii="Times New Roman" w:hAnsi="Times New Roman" w:cs="Times New Roman"/>
           <w:sz w:val="24"/>
           <w:szCs w:val="24"/>
         </w:rPr>
@@ -4472,13 +4704,14 @@
         <w:spacing w:after="40"/>
         <w:ind w:left="360"/>
         <w:rPr>
+          <w:rFonts w:ascii="Times New Roman" w:hAnsi="Times New Roman" w:cs="Times New Roman"/>
           <w:sz w:val="24"/>
           <w:szCs w:val="24"/>
         </w:rPr>
       </w:pPr>
       <w:r>
         <w:rPr>
-          <w:rFonts w:ascii="Consolas" w:hAnsi="Consolas" w:cs="Consolas"/>
+          <w:rFonts w:ascii="Times New Roman" w:hAnsi="Times New Roman" w:cs="Times New Roman"/>
           <w:b/>
           <w:sz w:val="24"/>
           <w:szCs w:val="24"/>
@@ -4671,13 +4904,14 @@
         <w:spacing w:after="40"/>
         <w:ind w:left="360"/>
         <w:rPr>
+          <w:rFonts w:ascii="Times New Roman" w:hAnsi="Times New Roman" w:cs="Times New Roman"/>
           <w:sz w:val="24"/>
           <w:szCs w:val="24"/>
         </w:rPr>
       </w:pPr>
       <w:r>
         <w:rPr>
-          <w:rFonts w:ascii="Consolas" w:hAnsi="Consolas" w:cs="Consolas"/>
+          <w:rFonts w:ascii="Times New Roman" w:hAnsi="Times New Roman" w:cs="Times New Roman"/>
           <w:b/>
           <w:sz w:val="24"/>
           <w:szCs w:val="24"/>
@@ -4798,13 +5032,14 @@
         <w:spacing w:after="40"/>
         <w:ind w:left="360"/>
         <w:rPr>
+          <w:rFonts w:ascii="Times New Roman" w:hAnsi="Times New Roman" w:cs="Times New Roman"/>
           <w:sz w:val="24"/>
           <w:szCs w:val="24"/>
         </w:rPr>
       </w:pPr>
       <w:r>
         <w:rPr>
-          <w:rFonts w:ascii="Consolas" w:hAnsi="Consolas" w:cs="Consolas"/>
+          <w:rFonts w:ascii="Times New Roman" w:hAnsi="Times New Roman" w:cs="Times New Roman"/>
           <w:b/>
           <w:sz w:val="24"/>
           <w:szCs w:val="24"/>
@@ -5058,6 +5293,7 @@
       <w:pPr>
         <w:spacing w:after="80"/>
         <w:rPr>
+          <w:rFonts w:ascii="Times New Roman" w:hAnsi="Times New Roman" w:cs="Times New Roman"/>
           <w:sz w:val="24"/>
           <w:szCs w:val="24"/>
         </w:rPr>
@@ -5066,65 +5302,113 @@
     <w:p>
       <w:pPr>
         <w:pStyle w:val="Heading2"/>
+        <w:rPr>
+          <w:rFonts w:cs="Times New Roman"/>
+        </w:rPr>
       </w:pPr>
       <w:bookmarkStart w:id="4" w:name="_Toc243839299"/>
       <w:r>
+        <w:rPr>
+          <w:rFonts w:cs="Times New Roman"/>
+        </w:rPr>
         <w:t xml:space="preserve">STEP 3 — </w:t>
       </w:r>
       <w:proofErr w:type="spellStart"/>
       <w:r>
+        <w:rPr>
+          <w:rFonts w:cs="Times New Roman"/>
+        </w:rPr>
         <w:t>Chuẩn</w:t>
       </w:r>
       <w:proofErr w:type="spellEnd"/>
       <w:r>
-        <w:t xml:space="preserve"> </w:t>
-      </w:r>
-      <w:proofErr w:type="spellStart"/>
-      <w:r>
+        <w:rPr>
+          <w:rFonts w:cs="Times New Roman"/>
+        </w:rPr>
+        <w:t xml:space="preserve"> </w:t>
+      </w:r>
+      <w:proofErr w:type="spellStart"/>
+      <w:r>
+        <w:rPr>
+          <w:rFonts w:cs="Times New Roman"/>
+        </w:rPr>
         <w:t>bị</w:t>
       </w:r>
       <w:proofErr w:type="spellEnd"/>
       <w:r>
-        <w:t xml:space="preserve"> </w:t>
-      </w:r>
-      <w:proofErr w:type="spellStart"/>
-      <w:r>
+        <w:rPr>
+          <w:rFonts w:cs="Times New Roman"/>
+        </w:rPr>
+        <w:t xml:space="preserve"> </w:t>
+      </w:r>
+      <w:proofErr w:type="spellStart"/>
+      <w:r>
+        <w:rPr>
+          <w:rFonts w:cs="Times New Roman"/>
+        </w:rPr>
         <w:t>Cơ</w:t>
       </w:r>
       <w:proofErr w:type="spellEnd"/>
       <w:r>
-        <w:t xml:space="preserve"> </w:t>
-      </w:r>
-      <w:proofErr w:type="spellStart"/>
-      <w:r>
+        <w:rPr>
+          <w:rFonts w:cs="Times New Roman"/>
+        </w:rPr>
+        <w:t xml:space="preserve"> </w:t>
+      </w:r>
+      <w:proofErr w:type="spellStart"/>
+      <w:r>
+        <w:rPr>
+          <w:rFonts w:cs="Times New Roman"/>
+        </w:rPr>
         <w:t>sở</w:t>
       </w:r>
       <w:proofErr w:type="spellEnd"/>
       <w:r>
-        <w:t xml:space="preserve"> </w:t>
-      </w:r>
-      <w:proofErr w:type="spellStart"/>
-      <w:r>
+        <w:rPr>
+          <w:rFonts w:cs="Times New Roman"/>
+        </w:rPr>
+        <w:t xml:space="preserve"> </w:t>
+      </w:r>
+      <w:proofErr w:type="spellStart"/>
+      <w:r>
+        <w:rPr>
+          <w:rFonts w:cs="Times New Roman"/>
+        </w:rPr>
         <w:t>dữ</w:t>
       </w:r>
       <w:proofErr w:type="spellEnd"/>
       <w:r>
-        <w:t xml:space="preserve"> </w:t>
-      </w:r>
-      <w:proofErr w:type="spellStart"/>
-      <w:r>
+        <w:rPr>
+          <w:rFonts w:cs="Times New Roman"/>
+        </w:rPr>
+        <w:t xml:space="preserve"> </w:t>
+      </w:r>
+      <w:proofErr w:type="spellStart"/>
+      <w:r>
+        <w:rPr>
+          <w:rFonts w:cs="Times New Roman"/>
+        </w:rPr>
         <w:t>liệu</w:t>
       </w:r>
       <w:proofErr w:type="spellEnd"/>
       <w:r>
+        <w:rPr>
+          <w:rFonts w:cs="Times New Roman"/>
+        </w:rPr>
         <w:t xml:space="preserve"> SQL Server (</w:t>
       </w:r>
       <w:proofErr w:type="spellStart"/>
       <w:r>
+        <w:rPr>
+          <w:rFonts w:cs="Times New Roman"/>
+        </w:rPr>
         <w:t>StudentDB</w:t>
       </w:r>
       <w:proofErr w:type="spellEnd"/>
       <w:r>
+        <w:rPr>
+          <w:rFonts w:cs="Times New Roman"/>
+        </w:rPr>
         <w:t>)</w:t>
       </w:r>
       <w:bookmarkEnd w:id="4"/>
@@ -5134,6 +5418,7 @@
         <w:spacing w:after="80"/>
         <w:jc w:val="both"/>
         <w:rPr>
+          <w:rFonts w:ascii="Times New Roman" w:hAnsi="Times New Roman" w:cs="Times New Roman"/>
           <w:sz w:val="24"/>
           <w:szCs w:val="24"/>
         </w:rPr>
@@ -5540,6 +5825,7 @@
         <w:spacing w:after="80"/>
         <w:jc w:val="both"/>
         <w:rPr>
+          <w:rFonts w:ascii="Times New Roman" w:hAnsi="Times New Roman" w:cs="Times New Roman"/>
           <w:sz w:val="24"/>
           <w:szCs w:val="24"/>
         </w:rPr>
@@ -5599,12 +5885,15 @@
         <w:spacing w:before="120" w:after="40"/>
         <w:jc w:val="center"/>
         <w:rPr>
+          <w:rFonts w:ascii="Times New Roman" w:hAnsi="Times New Roman" w:cs="Times New Roman"/>
           <w:sz w:val="24"/>
           <w:szCs w:val="24"/>
         </w:rPr>
       </w:pPr>
       <w:r>
         <w:rPr>
+          <w:rFonts w:ascii="Times New Roman" w:hAnsi="Times New Roman" w:cs="Times New Roman"/>
+          <w:noProof/>
           <w:sz w:val="24"/>
           <w:szCs w:val="24"/>
         </w:rPr>
@@ -5651,6 +5940,7 @@
         <w:spacing w:after="120"/>
         <w:jc w:val="center"/>
         <w:rPr>
+          <w:rFonts w:ascii="Times New Roman" w:hAnsi="Times New Roman" w:cs="Times New Roman"/>
           <w:sz w:val="24"/>
           <w:szCs w:val="24"/>
         </w:rPr>
@@ -5921,6 +6211,7 @@
         <w:spacing w:after="80"/>
         <w:jc w:val="both"/>
         <w:rPr>
+          <w:rFonts w:ascii="Times New Roman" w:hAnsi="Times New Roman" w:cs="Times New Roman"/>
           <w:sz w:val="24"/>
           <w:szCs w:val="24"/>
         </w:rPr>
@@ -5940,6 +6231,7 @@
         <w:spacing w:after="40"/>
         <w:ind w:left="360"/>
         <w:rPr>
+          <w:rFonts w:ascii="Times New Roman" w:hAnsi="Times New Roman" w:cs="Times New Roman"/>
           <w:sz w:val="24"/>
           <w:szCs w:val="24"/>
         </w:rPr>
@@ -5955,7 +6247,7 @@
       </w:r>
       <w:r>
         <w:rPr>
-          <w:rFonts w:ascii="Consolas" w:hAnsi="Consolas" w:cs="Consolas"/>
+          <w:rFonts w:ascii="Times New Roman" w:hAnsi="Times New Roman" w:cs="Times New Roman"/>
           <w:sz w:val="24"/>
           <w:szCs w:val="24"/>
         </w:rPr>
@@ -5964,7 +6256,7 @@
       <w:proofErr w:type="spellStart"/>
       <w:r>
         <w:rPr>
-          <w:rFonts w:ascii="Consolas" w:hAnsi="Consolas" w:cs="Consolas"/>
+          <w:rFonts w:ascii="Times New Roman" w:hAnsi="Times New Roman" w:cs="Times New Roman"/>
           <w:sz w:val="24"/>
           <w:szCs w:val="24"/>
         </w:rPr>
@@ -5973,7 +6265,7 @@
       <w:proofErr w:type="spellEnd"/>
       <w:r>
         <w:rPr>
-          <w:rFonts w:ascii="Consolas" w:hAnsi="Consolas" w:cs="Consolas"/>
+          <w:rFonts w:ascii="Times New Roman" w:hAnsi="Times New Roman" w:cs="Times New Roman"/>
           <w:sz w:val="24"/>
           <w:szCs w:val="24"/>
         </w:rPr>
@@ -5985,6 +6277,7 @@
         <w:spacing w:after="80"/>
         <w:jc w:val="both"/>
         <w:rPr>
+          <w:rFonts w:ascii="Times New Roman" w:hAnsi="Times New Roman" w:cs="Times New Roman"/>
           <w:sz w:val="24"/>
           <w:szCs w:val="24"/>
         </w:rPr>
@@ -6004,13 +6297,14 @@
         <w:spacing w:after="40"/>
         <w:ind w:left="360"/>
         <w:rPr>
+          <w:rFonts w:ascii="Times New Roman" w:hAnsi="Times New Roman" w:cs="Times New Roman"/>
           <w:sz w:val="24"/>
           <w:szCs w:val="24"/>
         </w:rPr>
       </w:pPr>
       <w:r>
         <w:rPr>
-          <w:rFonts w:ascii="Consolas" w:hAnsi="Consolas" w:cs="Consolas"/>
+          <w:rFonts w:ascii="Times New Roman" w:hAnsi="Times New Roman" w:cs="Times New Roman"/>
           <w:b/>
           <w:sz w:val="24"/>
           <w:szCs w:val="24"/>
@@ -6203,13 +6497,14 @@
         <w:spacing w:after="40"/>
         <w:ind w:left="360"/>
         <w:rPr>
+          <w:rFonts w:ascii="Times New Roman" w:hAnsi="Times New Roman" w:cs="Times New Roman"/>
           <w:sz w:val="24"/>
           <w:szCs w:val="24"/>
         </w:rPr>
       </w:pPr>
       <w:r>
         <w:rPr>
-          <w:rFonts w:ascii="Consolas" w:hAnsi="Consolas" w:cs="Consolas"/>
+          <w:rFonts w:ascii="Times New Roman" w:hAnsi="Times New Roman" w:cs="Times New Roman"/>
           <w:b/>
           <w:sz w:val="24"/>
           <w:szCs w:val="24"/>
@@ -6320,13 +6615,14 @@
         <w:spacing w:after="40"/>
         <w:ind w:left="360"/>
         <w:rPr>
+          <w:rFonts w:ascii="Times New Roman" w:hAnsi="Times New Roman" w:cs="Times New Roman"/>
           <w:sz w:val="24"/>
           <w:szCs w:val="24"/>
         </w:rPr>
       </w:pPr>
       <w:r>
         <w:rPr>
-          <w:rFonts w:ascii="Consolas" w:hAnsi="Consolas" w:cs="Consolas"/>
+          <w:rFonts w:ascii="Times New Roman" w:hAnsi="Times New Roman" w:cs="Times New Roman"/>
           <w:b/>
           <w:sz w:val="24"/>
           <w:szCs w:val="24"/>
@@ -6536,6 +6832,7 @@
       <w:pPr>
         <w:spacing w:after="80"/>
         <w:rPr>
+          <w:rFonts w:ascii="Times New Roman" w:hAnsi="Times New Roman" w:cs="Times New Roman"/>
           <w:sz w:val="24"/>
           <w:szCs w:val="24"/>
         </w:rPr>
@@ -6544,45 +6841,75 @@
     <w:p>
       <w:pPr>
         <w:pStyle w:val="Heading2"/>
+        <w:rPr>
+          <w:rFonts w:cs="Times New Roman"/>
+        </w:rPr>
       </w:pPr>
       <w:bookmarkStart w:id="5" w:name="_Toc243839300"/>
       <w:r>
+        <w:rPr>
+          <w:rFonts w:cs="Times New Roman"/>
+        </w:rPr>
         <w:t xml:space="preserve">STEP 4 — </w:t>
       </w:r>
       <w:proofErr w:type="spellStart"/>
       <w:r>
+        <w:rPr>
+          <w:rFonts w:cs="Times New Roman"/>
+        </w:rPr>
         <w:t>Cấu</w:t>
       </w:r>
       <w:proofErr w:type="spellEnd"/>
       <w:r>
-        <w:t xml:space="preserve"> </w:t>
-      </w:r>
-      <w:proofErr w:type="spellStart"/>
-      <w:r>
+        <w:rPr>
+          <w:rFonts w:cs="Times New Roman"/>
+        </w:rPr>
+        <w:t xml:space="preserve"> </w:t>
+      </w:r>
+      <w:proofErr w:type="spellStart"/>
+      <w:r>
+        <w:rPr>
+          <w:rFonts w:cs="Times New Roman"/>
+        </w:rPr>
         <w:t>hình</w:t>
       </w:r>
       <w:proofErr w:type="spellEnd"/>
       <w:r>
+        <w:rPr>
+          <w:rFonts w:cs="Times New Roman"/>
+        </w:rPr>
         <w:t xml:space="preserve"> </w:t>
       </w:r>
       <w:proofErr w:type="spellStart"/>
       <w:proofErr w:type="gramStart"/>
       <w:r>
+        <w:rPr>
+          <w:rFonts w:cs="Times New Roman"/>
+        </w:rPr>
         <w:t>application.properties</w:t>
       </w:r>
       <w:proofErr w:type="spellEnd"/>
       <w:proofErr w:type="gramEnd"/>
       <w:r>
+        <w:rPr>
+          <w:rFonts w:cs="Times New Roman"/>
+        </w:rPr>
         <w:t xml:space="preserve"> &amp; </w:t>
       </w:r>
       <w:proofErr w:type="spellStart"/>
       <w:proofErr w:type="gramStart"/>
       <w:r>
+        <w:rPr>
+          <w:rFonts w:cs="Times New Roman"/>
+        </w:rPr>
         <w:t>messages.properties</w:t>
       </w:r>
       <w:proofErr w:type="spellEnd"/>
       <w:proofErr w:type="gramEnd"/>
       <w:r>
+        <w:rPr>
+          <w:rFonts w:cs="Times New Roman"/>
+        </w:rPr>
         <w:t xml:space="preserve"> (TODO 17)</w:t>
       </w:r>
       <w:bookmarkEnd w:id="5"/>
@@ -6592,6 +6919,7 @@
         <w:spacing w:after="80"/>
         <w:jc w:val="both"/>
         <w:rPr>
+          <w:rFonts w:ascii="Times New Roman" w:hAnsi="Times New Roman" w:cs="Times New Roman"/>
           <w:sz w:val="24"/>
           <w:szCs w:val="24"/>
         </w:rPr>
@@ -7100,6 +7428,7 @@
         <w:spacing w:after="80"/>
         <w:jc w:val="both"/>
         <w:rPr>
+          <w:rFonts w:ascii="Times New Roman" w:hAnsi="Times New Roman" w:cs="Times New Roman"/>
           <w:sz w:val="24"/>
           <w:szCs w:val="24"/>
         </w:rPr>
@@ -7159,16 +7488,18 @@
         <w:spacing w:before="120" w:after="40"/>
         <w:jc w:val="center"/>
         <w:rPr>
+          <w:rFonts w:ascii="Times New Roman" w:hAnsi="Times New Roman" w:cs="Times New Roman"/>
           <w:sz w:val="24"/>
           <w:szCs w:val="24"/>
         </w:rPr>
       </w:pPr>
       <w:r>
         <w:rPr>
-          <w:sz w:val="24"/>
-          <w:szCs w:val="24"/>
-        </w:rPr>
-        <w:lastRenderedPageBreak/>
+          <w:rFonts w:ascii="Times New Roman" w:hAnsi="Times New Roman" w:cs="Times New Roman"/>
+          <w:noProof/>
+          <w:sz w:val="24"/>
+          <w:szCs w:val="24"/>
+        </w:rPr>
         <w:drawing>
           <wp:inline distT="0" distB="0" distL="0" distR="0" wp14:anchorId="7F68D0D6" wp14:editId="47E2A3B1">
             <wp:extent cx="6309360" cy="2937510"/>
@@ -7211,6 +7542,7 @@
         <w:spacing w:after="120"/>
         <w:jc w:val="center"/>
         <w:rPr>
+          <w:rFonts w:ascii="Times New Roman" w:hAnsi="Times New Roman" w:cs="Times New Roman"/>
           <w:sz w:val="24"/>
           <w:szCs w:val="24"/>
         </w:rPr>
@@ -7222,6 +7554,7 @@
           <w:sz w:val="24"/>
           <w:szCs w:val="24"/>
         </w:rPr>
+        <w:lastRenderedPageBreak/>
         <w:t xml:space="preserve"> </w:t>
       </w:r>
       <w:proofErr w:type="spellStart"/>
@@ -7465,6 +7798,7 @@
         <w:spacing w:after="80"/>
         <w:jc w:val="both"/>
         <w:rPr>
+          <w:rFonts w:ascii="Times New Roman" w:hAnsi="Times New Roman" w:cs="Times New Roman"/>
           <w:sz w:val="24"/>
           <w:szCs w:val="24"/>
         </w:rPr>
@@ -7484,6 +7818,7 @@
         <w:spacing w:after="40"/>
         <w:ind w:left="360"/>
         <w:rPr>
+          <w:rFonts w:ascii="Times New Roman" w:hAnsi="Times New Roman" w:cs="Times New Roman"/>
           <w:sz w:val="24"/>
           <w:szCs w:val="24"/>
         </w:rPr>
@@ -7499,7 +7834,7 @@
       </w:r>
       <w:r>
         <w:rPr>
-          <w:rFonts w:ascii="Consolas" w:hAnsi="Consolas" w:cs="Consolas"/>
+          <w:rFonts w:ascii="Times New Roman" w:hAnsi="Times New Roman" w:cs="Times New Roman"/>
           <w:sz w:val="24"/>
           <w:szCs w:val="24"/>
         </w:rPr>
@@ -7511,6 +7846,7 @@
         <w:spacing w:after="80"/>
         <w:jc w:val="both"/>
         <w:rPr>
+          <w:rFonts w:ascii="Times New Roman" w:hAnsi="Times New Roman" w:cs="Times New Roman"/>
           <w:sz w:val="24"/>
           <w:szCs w:val="24"/>
         </w:rPr>
@@ -7530,13 +7866,14 @@
         <w:spacing w:after="40"/>
         <w:ind w:left="360"/>
         <w:rPr>
+          <w:rFonts w:ascii="Times New Roman" w:hAnsi="Times New Roman" w:cs="Times New Roman"/>
           <w:sz w:val="24"/>
           <w:szCs w:val="24"/>
         </w:rPr>
       </w:pPr>
       <w:r>
         <w:rPr>
-          <w:rFonts w:ascii="Consolas" w:hAnsi="Consolas" w:cs="Consolas"/>
+          <w:rFonts w:ascii="Times New Roman" w:hAnsi="Times New Roman" w:cs="Times New Roman"/>
           <w:b/>
           <w:sz w:val="24"/>
           <w:szCs w:val="24"/>
@@ -7677,13 +8014,14 @@
         <w:spacing w:after="40"/>
         <w:ind w:left="360"/>
         <w:rPr>
+          <w:rFonts w:ascii="Times New Roman" w:hAnsi="Times New Roman" w:cs="Times New Roman"/>
           <w:sz w:val="24"/>
           <w:szCs w:val="24"/>
         </w:rPr>
       </w:pPr>
       <w:r>
         <w:rPr>
-          <w:rFonts w:ascii="Consolas" w:hAnsi="Consolas" w:cs="Consolas"/>
+          <w:rFonts w:ascii="Times New Roman" w:hAnsi="Times New Roman" w:cs="Times New Roman"/>
           <w:b/>
           <w:sz w:val="24"/>
           <w:szCs w:val="24"/>
@@ -7930,13 +8268,14 @@
         <w:spacing w:after="40"/>
         <w:ind w:left="360"/>
         <w:rPr>
+          <w:rFonts w:ascii="Times New Roman" w:hAnsi="Times New Roman" w:cs="Times New Roman"/>
           <w:sz w:val="24"/>
           <w:szCs w:val="24"/>
         </w:rPr>
       </w:pPr>
       <w:r>
         <w:rPr>
-          <w:rFonts w:ascii="Consolas" w:hAnsi="Consolas" w:cs="Consolas"/>
+          <w:rFonts w:ascii="Times New Roman" w:hAnsi="Times New Roman" w:cs="Times New Roman"/>
           <w:b/>
           <w:sz w:val="24"/>
           <w:szCs w:val="24"/>
@@ -8166,6 +8505,7 @@
       <w:pPr>
         <w:spacing w:after="80"/>
         <w:rPr>
+          <w:rFonts w:ascii="Times New Roman" w:hAnsi="Times New Roman" w:cs="Times New Roman"/>
           <w:sz w:val="24"/>
           <w:szCs w:val="24"/>
         </w:rPr>
@@ -8174,9 +8514,15 @@
     <w:p>
       <w:pPr>
         <w:pStyle w:val="Heading1"/>
+        <w:rPr>
+          <w:rFonts w:cs="Times New Roman"/>
+        </w:rPr>
       </w:pPr>
       <w:bookmarkStart w:id="6" w:name="_Toc243839301"/>
       <w:r>
+        <w:rPr>
+          <w:rFonts w:cs="Times New Roman"/>
+        </w:rPr>
         <w:t>Backend: Entity, Repository &amp; Service (STEP 5 – 7)</w:t>
       </w:r>
       <w:bookmarkEnd w:id="6"/>
@@ -8184,25 +8530,43 @@
     <w:p>
       <w:pPr>
         <w:pStyle w:val="Heading2"/>
+        <w:rPr>
+          <w:rFonts w:cs="Times New Roman"/>
+        </w:rPr>
       </w:pPr>
       <w:bookmarkStart w:id="7" w:name="_Toc243839302"/>
       <w:r>
+        <w:rPr>
+          <w:rFonts w:cs="Times New Roman"/>
+        </w:rPr>
         <w:t xml:space="preserve">STEP 5 — </w:t>
       </w:r>
       <w:proofErr w:type="spellStart"/>
       <w:r>
+        <w:rPr>
+          <w:rFonts w:cs="Times New Roman"/>
+        </w:rPr>
         <w:t>Xây</w:t>
       </w:r>
       <w:proofErr w:type="spellEnd"/>
       <w:r>
-        <w:t xml:space="preserve"> </w:t>
-      </w:r>
-      <w:proofErr w:type="spellStart"/>
-      <w:r>
+        <w:rPr>
+          <w:rFonts w:cs="Times New Roman"/>
+        </w:rPr>
+        <w:t xml:space="preserve"> </w:t>
+      </w:r>
+      <w:proofErr w:type="spellStart"/>
+      <w:r>
+        <w:rPr>
+          <w:rFonts w:cs="Times New Roman"/>
+        </w:rPr>
         <w:t>dựng</w:t>
       </w:r>
       <w:proofErr w:type="spellEnd"/>
       <w:r>
+        <w:rPr>
+          <w:rFonts w:cs="Times New Roman"/>
+        </w:rPr>
         <w:t xml:space="preserve"> Entity Student &amp; Bean Validation (TODO 1, 2, 3, 18)</w:t>
       </w:r>
       <w:bookmarkEnd w:id="7"/>
@@ -8212,6 +8576,7 @@
         <w:spacing w:after="80"/>
         <w:jc w:val="both"/>
         <w:rPr>
+          <w:rFonts w:ascii="Times New Roman" w:hAnsi="Times New Roman" w:cs="Times New Roman"/>
           <w:sz w:val="24"/>
           <w:szCs w:val="24"/>
         </w:rPr>
@@ -8664,6 +9029,7 @@
         <w:spacing w:after="80"/>
         <w:jc w:val="both"/>
         <w:rPr>
+          <w:rFonts w:ascii="Times New Roman" w:hAnsi="Times New Roman" w:cs="Times New Roman"/>
           <w:sz w:val="24"/>
           <w:szCs w:val="24"/>
         </w:rPr>
@@ -8723,16 +9089,18 @@
         <w:spacing w:before="120" w:after="40"/>
         <w:jc w:val="center"/>
         <w:rPr>
+          <w:rFonts w:ascii="Times New Roman" w:hAnsi="Times New Roman" w:cs="Times New Roman"/>
           <w:sz w:val="24"/>
           <w:szCs w:val="24"/>
         </w:rPr>
       </w:pPr>
       <w:r>
         <w:rPr>
-          <w:sz w:val="24"/>
-          <w:szCs w:val="24"/>
-        </w:rPr>
-        <w:lastRenderedPageBreak/>
+          <w:rFonts w:ascii="Times New Roman" w:hAnsi="Times New Roman" w:cs="Times New Roman"/>
+          <w:noProof/>
+          <w:sz w:val="24"/>
+          <w:szCs w:val="24"/>
+        </w:rPr>
         <w:drawing>
           <wp:inline distT="0" distB="0" distL="0" distR="0" wp14:anchorId="0801BE69" wp14:editId="396BCFB2">
             <wp:extent cx="6309360" cy="4001135"/>
@@ -8775,15 +9143,19 @@
         <w:spacing w:before="120" w:after="40"/>
         <w:jc w:val="center"/>
         <w:rPr>
+          <w:rFonts w:ascii="Times New Roman" w:hAnsi="Times New Roman" w:cs="Times New Roman"/>
           <w:sz w:val="24"/>
           <w:szCs w:val="24"/>
         </w:rPr>
       </w:pPr>
       <w:r>
         <w:rPr>
-          <w:sz w:val="24"/>
-          <w:szCs w:val="24"/>
-        </w:rPr>
+          <w:rFonts w:ascii="Times New Roman" w:hAnsi="Times New Roman" w:cs="Times New Roman"/>
+          <w:noProof/>
+          <w:sz w:val="24"/>
+          <w:szCs w:val="24"/>
+        </w:rPr>
+        <w:lastRenderedPageBreak/>
         <w:drawing>
           <wp:inline distT="0" distB="0" distL="0" distR="0" wp14:anchorId="34033E2E" wp14:editId="401E4D4C">
             <wp:extent cx="6309360" cy="1985645"/>
@@ -8826,6 +9198,7 @@
         <w:spacing w:after="120"/>
         <w:jc w:val="center"/>
         <w:rPr>
+          <w:rFonts w:ascii="Times New Roman" w:hAnsi="Times New Roman" w:cs="Times New Roman"/>
           <w:sz w:val="24"/>
           <w:szCs w:val="24"/>
         </w:rPr>
@@ -8965,6 +9338,7 @@
         <w:spacing w:after="80"/>
         <w:jc w:val="both"/>
         <w:rPr>
+          <w:rFonts w:ascii="Times New Roman" w:hAnsi="Times New Roman" w:cs="Times New Roman"/>
           <w:sz w:val="24"/>
           <w:szCs w:val="24"/>
         </w:rPr>
@@ -8984,6 +9358,7 @@
         <w:spacing w:after="40"/>
         <w:ind w:left="360"/>
         <w:rPr>
+          <w:rFonts w:ascii="Times New Roman" w:hAnsi="Times New Roman" w:cs="Times New Roman"/>
           <w:sz w:val="24"/>
           <w:szCs w:val="24"/>
         </w:rPr>
@@ -8999,7 +9374,7 @@
       </w:r>
       <w:r>
         <w:rPr>
-          <w:rFonts w:ascii="Consolas" w:hAnsi="Consolas" w:cs="Consolas"/>
+          <w:rFonts w:ascii="Times New Roman" w:hAnsi="Times New Roman" w:cs="Times New Roman"/>
           <w:sz w:val="24"/>
           <w:szCs w:val="24"/>
         </w:rPr>
@@ -9011,6 +9386,7 @@
         <w:spacing w:after="80"/>
         <w:jc w:val="both"/>
         <w:rPr>
+          <w:rFonts w:ascii="Times New Roman" w:hAnsi="Times New Roman" w:cs="Times New Roman"/>
           <w:sz w:val="24"/>
           <w:szCs w:val="24"/>
         </w:rPr>
@@ -9030,13 +9406,14 @@
         <w:spacing w:after="40"/>
         <w:ind w:left="360"/>
         <w:rPr>
+          <w:rFonts w:ascii="Times New Roman" w:hAnsi="Times New Roman" w:cs="Times New Roman"/>
           <w:sz w:val="24"/>
           <w:szCs w:val="24"/>
         </w:rPr>
       </w:pPr>
       <w:r>
         <w:rPr>
-          <w:rFonts w:ascii="Consolas" w:hAnsi="Consolas" w:cs="Consolas"/>
+          <w:rFonts w:ascii="Times New Roman" w:hAnsi="Times New Roman" w:cs="Times New Roman"/>
           <w:b/>
           <w:sz w:val="24"/>
           <w:szCs w:val="24"/>
@@ -9183,13 +9560,14 @@
         <w:spacing w:after="40"/>
         <w:ind w:left="360"/>
         <w:rPr>
+          <w:rFonts w:ascii="Times New Roman" w:hAnsi="Times New Roman" w:cs="Times New Roman"/>
           <w:sz w:val="24"/>
           <w:szCs w:val="24"/>
         </w:rPr>
       </w:pPr>
       <w:r>
         <w:rPr>
-          <w:rFonts w:ascii="Consolas" w:hAnsi="Consolas" w:cs="Consolas"/>
+          <w:rFonts w:ascii="Times New Roman" w:hAnsi="Times New Roman" w:cs="Times New Roman"/>
           <w:b/>
           <w:sz w:val="24"/>
           <w:szCs w:val="24"/>
@@ -9256,13 +9634,14 @@
         <w:spacing w:after="40"/>
         <w:ind w:left="360"/>
         <w:rPr>
+          <w:rFonts w:ascii="Times New Roman" w:hAnsi="Times New Roman" w:cs="Times New Roman"/>
           <w:sz w:val="24"/>
           <w:szCs w:val="24"/>
         </w:rPr>
       </w:pPr>
       <w:r>
         <w:rPr>
-          <w:rFonts w:ascii="Consolas" w:hAnsi="Consolas" w:cs="Consolas"/>
+          <w:rFonts w:ascii="Times New Roman" w:hAnsi="Times New Roman" w:cs="Times New Roman"/>
           <w:b/>
           <w:sz w:val="24"/>
           <w:szCs w:val="24"/>
@@ -9536,6 +9915,7 @@
       <w:pPr>
         <w:spacing w:after="80"/>
         <w:rPr>
+          <w:rFonts w:ascii="Times New Roman" w:hAnsi="Times New Roman" w:cs="Times New Roman"/>
           <w:sz w:val="24"/>
           <w:szCs w:val="24"/>
         </w:rPr>
@@ -9544,41 +9924,71 @@
     <w:p>
       <w:pPr>
         <w:pStyle w:val="Heading2"/>
+        <w:rPr>
+          <w:rFonts w:cs="Times New Roman"/>
+        </w:rPr>
       </w:pPr>
       <w:bookmarkStart w:id="8" w:name="_Toc243839303"/>
       <w:r>
+        <w:rPr>
+          <w:rFonts w:cs="Times New Roman"/>
+        </w:rPr>
         <w:t xml:space="preserve">STEP 6 — </w:t>
       </w:r>
       <w:proofErr w:type="spellStart"/>
       <w:r>
+        <w:rPr>
+          <w:rFonts w:cs="Times New Roman"/>
+        </w:rPr>
         <w:t>Xây</w:t>
       </w:r>
       <w:proofErr w:type="spellEnd"/>
       <w:r>
-        <w:t xml:space="preserve"> </w:t>
-      </w:r>
-      <w:proofErr w:type="spellStart"/>
-      <w:r>
+        <w:rPr>
+          <w:rFonts w:cs="Times New Roman"/>
+        </w:rPr>
+        <w:t xml:space="preserve"> </w:t>
+      </w:r>
+      <w:proofErr w:type="spellStart"/>
+      <w:r>
+        <w:rPr>
+          <w:rFonts w:cs="Times New Roman"/>
+        </w:rPr>
         <w:t>dựng</w:t>
       </w:r>
       <w:proofErr w:type="spellEnd"/>
       <w:r>
-        <w:t xml:space="preserve"> </w:t>
-      </w:r>
-      <w:proofErr w:type="spellStart"/>
-      <w:r>
+        <w:rPr>
+          <w:rFonts w:cs="Times New Roman"/>
+        </w:rPr>
+        <w:t xml:space="preserve"> </w:t>
+      </w:r>
+      <w:proofErr w:type="spellStart"/>
+      <w:r>
+        <w:rPr>
+          <w:rFonts w:cs="Times New Roman"/>
+        </w:rPr>
         <w:t>StudentRepository</w:t>
       </w:r>
       <w:proofErr w:type="spellEnd"/>
       <w:r>
-        <w:t xml:space="preserve"> </w:t>
-      </w:r>
-      <w:proofErr w:type="spellStart"/>
-      <w:r>
+        <w:rPr>
+          <w:rFonts w:cs="Times New Roman"/>
+        </w:rPr>
+        <w:t xml:space="preserve"> </w:t>
+      </w:r>
+      <w:proofErr w:type="spellStart"/>
+      <w:r>
+        <w:rPr>
+          <w:rFonts w:cs="Times New Roman"/>
+        </w:rPr>
         <w:t>với</w:t>
       </w:r>
       <w:proofErr w:type="spellEnd"/>
       <w:r>
+        <w:rPr>
+          <w:rFonts w:cs="Times New Roman"/>
+        </w:rPr>
         <w:t xml:space="preserve"> Derived Query (TODO 19)</w:t>
       </w:r>
       <w:bookmarkEnd w:id="8"/>
@@ -9588,6 +9998,7 @@
         <w:spacing w:after="80"/>
         <w:jc w:val="both"/>
         <w:rPr>
+          <w:rFonts w:ascii="Times New Roman" w:hAnsi="Times New Roman" w:cs="Times New Roman"/>
           <w:sz w:val="24"/>
           <w:szCs w:val="24"/>
         </w:rPr>
@@ -9688,25 +10099,7 @@
           <w:sz w:val="24"/>
           <w:szCs w:val="24"/>
         </w:rPr>
-        <w:t xml:space="preserve">&lt;Student, </w:t>
-      </w:r>
-      <w:proofErr w:type="gramStart"/>
-      <w:r>
-        <w:rPr>
-          <w:rFonts w:ascii="Times New Roman" w:hAnsi="Times New Roman" w:cs="Times New Roman"/>
-          <w:sz w:val="24"/>
-          <w:szCs w:val="24"/>
-        </w:rPr>
-        <w:t>Long</w:t>
-      </w:r>
-      <w:proofErr w:type="gramEnd"/>
-      <w:r>
-        <w:rPr>
-          <w:rFonts w:ascii="Times New Roman" w:hAnsi="Times New Roman" w:cs="Times New Roman"/>
-          <w:sz w:val="24"/>
-          <w:szCs w:val="24"/>
-        </w:rPr>
-        <w:t xml:space="preserve">&gt;. Cài </w:t>
+        <w:t xml:space="preserve">&lt;Student, Long&gt;. Cài </w:t>
       </w:r>
       <w:proofErr w:type="spellStart"/>
       <w:r>
@@ -10290,6 +10683,7 @@
         <w:spacing w:after="80"/>
         <w:jc w:val="both"/>
         <w:rPr>
+          <w:rFonts w:ascii="Times New Roman" w:hAnsi="Times New Roman" w:cs="Times New Roman"/>
           <w:sz w:val="24"/>
           <w:szCs w:val="24"/>
         </w:rPr>
@@ -10349,12 +10743,15 @@
         <w:spacing w:before="120" w:after="40"/>
         <w:jc w:val="center"/>
         <w:rPr>
+          <w:rFonts w:ascii="Times New Roman" w:hAnsi="Times New Roman" w:cs="Times New Roman"/>
           <w:sz w:val="24"/>
           <w:szCs w:val="24"/>
         </w:rPr>
       </w:pPr>
       <w:r>
         <w:rPr>
+          <w:rFonts w:ascii="Times New Roman" w:hAnsi="Times New Roman" w:cs="Times New Roman"/>
+          <w:noProof/>
           <w:sz w:val="24"/>
           <w:szCs w:val="24"/>
         </w:rPr>
@@ -10400,6 +10797,7 @@
         <w:spacing w:after="120"/>
         <w:jc w:val="center"/>
         <w:rPr>
+          <w:rFonts w:ascii="Times New Roman" w:hAnsi="Times New Roman" w:cs="Times New Roman"/>
           <w:sz w:val="24"/>
           <w:szCs w:val="24"/>
         </w:rPr>
@@ -10521,6 +10919,7 @@
         <w:spacing w:after="80"/>
         <w:jc w:val="both"/>
         <w:rPr>
+          <w:rFonts w:ascii="Times New Roman" w:hAnsi="Times New Roman" w:cs="Times New Roman"/>
           <w:sz w:val="24"/>
           <w:szCs w:val="24"/>
         </w:rPr>
@@ -10540,6 +10939,7 @@
         <w:spacing w:after="40"/>
         <w:ind w:left="360"/>
         <w:rPr>
+          <w:rFonts w:ascii="Times New Roman" w:hAnsi="Times New Roman" w:cs="Times New Roman"/>
           <w:sz w:val="24"/>
           <w:szCs w:val="24"/>
         </w:rPr>
@@ -10551,11 +10951,12 @@
           <w:sz w:val="24"/>
           <w:szCs w:val="24"/>
         </w:rPr>
+        <w:lastRenderedPageBreak/>
         <w:t xml:space="preserve">◦ </w:t>
       </w:r>
       <w:r>
         <w:rPr>
-          <w:rFonts w:ascii="Consolas" w:hAnsi="Consolas" w:cs="Consolas"/>
+          <w:rFonts w:ascii="Times New Roman" w:hAnsi="Times New Roman" w:cs="Times New Roman"/>
           <w:sz w:val="24"/>
           <w:szCs w:val="24"/>
         </w:rPr>
@@ -10564,7 +10965,7 @@
       <w:proofErr w:type="spellStart"/>
       <w:r>
         <w:rPr>
-          <w:rFonts w:ascii="Consolas" w:hAnsi="Consolas" w:cs="Consolas"/>
+          <w:rFonts w:ascii="Times New Roman" w:hAnsi="Times New Roman" w:cs="Times New Roman"/>
           <w:sz w:val="24"/>
           <w:szCs w:val="24"/>
         </w:rPr>
@@ -10573,7 +10974,7 @@
       <w:proofErr w:type="spellEnd"/>
       <w:r>
         <w:rPr>
-          <w:rFonts w:ascii="Consolas" w:hAnsi="Consolas" w:cs="Consolas"/>
+          <w:rFonts w:ascii="Times New Roman" w:hAnsi="Times New Roman" w:cs="Times New Roman"/>
           <w:sz w:val="24"/>
           <w:szCs w:val="24"/>
         </w:rPr>
@@ -10585,6 +10986,7 @@
         <w:spacing w:after="80"/>
         <w:jc w:val="both"/>
         <w:rPr>
+          <w:rFonts w:ascii="Times New Roman" w:hAnsi="Times New Roman" w:cs="Times New Roman"/>
           <w:sz w:val="24"/>
           <w:szCs w:val="24"/>
         </w:rPr>
@@ -10604,13 +11006,14 @@
         <w:spacing w:after="40"/>
         <w:ind w:left="360"/>
         <w:rPr>
+          <w:rFonts w:ascii="Times New Roman" w:hAnsi="Times New Roman" w:cs="Times New Roman"/>
           <w:sz w:val="24"/>
           <w:szCs w:val="24"/>
         </w:rPr>
       </w:pPr>
       <w:r>
         <w:rPr>
-          <w:rFonts w:ascii="Consolas" w:hAnsi="Consolas" w:cs="Consolas"/>
+          <w:rFonts w:ascii="Times New Roman" w:hAnsi="Times New Roman" w:cs="Times New Roman"/>
           <w:b/>
           <w:sz w:val="24"/>
           <w:szCs w:val="24"/>
@@ -10667,13 +11070,14 @@
         <w:spacing w:after="40"/>
         <w:ind w:left="360"/>
         <w:rPr>
+          <w:rFonts w:ascii="Times New Roman" w:hAnsi="Times New Roman" w:cs="Times New Roman"/>
           <w:sz w:val="24"/>
           <w:szCs w:val="24"/>
         </w:rPr>
       </w:pPr>
       <w:r>
         <w:rPr>
-          <w:rFonts w:ascii="Consolas" w:hAnsi="Consolas" w:cs="Consolas"/>
+          <w:rFonts w:ascii="Times New Roman" w:hAnsi="Times New Roman" w:cs="Times New Roman"/>
           <w:b/>
           <w:sz w:val="24"/>
           <w:szCs w:val="24"/>
@@ -10820,13 +11224,14 @@
         <w:spacing w:after="40"/>
         <w:ind w:left="360"/>
         <w:rPr>
+          <w:rFonts w:ascii="Times New Roman" w:hAnsi="Times New Roman" w:cs="Times New Roman"/>
           <w:sz w:val="24"/>
           <w:szCs w:val="24"/>
         </w:rPr>
       </w:pPr>
       <w:r>
         <w:rPr>
-          <w:rFonts w:ascii="Consolas" w:hAnsi="Consolas" w:cs="Consolas"/>
+          <w:rFonts w:ascii="Times New Roman" w:hAnsi="Times New Roman" w:cs="Times New Roman"/>
           <w:b/>
           <w:sz w:val="24"/>
           <w:szCs w:val="24"/>
@@ -10973,13 +11378,14 @@
         <w:spacing w:after="40"/>
         <w:ind w:left="360"/>
         <w:rPr>
+          <w:rFonts w:ascii="Times New Roman" w:hAnsi="Times New Roman" w:cs="Times New Roman"/>
           <w:sz w:val="24"/>
           <w:szCs w:val="24"/>
         </w:rPr>
       </w:pPr>
       <w:r>
         <w:rPr>
-          <w:rFonts w:ascii="Consolas" w:hAnsi="Consolas" w:cs="Consolas"/>
+          <w:rFonts w:ascii="Times New Roman" w:hAnsi="Times New Roman" w:cs="Times New Roman"/>
           <w:b/>
           <w:sz w:val="24"/>
           <w:szCs w:val="24"/>
@@ -11171,6 +11577,7 @@
       <w:pPr>
         <w:spacing w:after="80"/>
         <w:rPr>
+          <w:rFonts w:ascii="Times New Roman" w:hAnsi="Times New Roman" w:cs="Times New Roman"/>
           <w:sz w:val="24"/>
           <w:szCs w:val="24"/>
         </w:rPr>
@@ -11179,41 +11586,71 @@
     <w:p>
       <w:pPr>
         <w:pStyle w:val="Heading2"/>
+        <w:rPr>
+          <w:rFonts w:cs="Times New Roman"/>
+        </w:rPr>
       </w:pPr>
       <w:bookmarkStart w:id="9" w:name="_Toc243839304"/>
       <w:r>
+        <w:rPr>
+          <w:rFonts w:cs="Times New Roman"/>
+        </w:rPr>
         <w:t xml:space="preserve">STEP 7 — Cài </w:t>
       </w:r>
       <w:proofErr w:type="spellStart"/>
       <w:r>
+        <w:rPr>
+          <w:rFonts w:cs="Times New Roman"/>
+        </w:rPr>
         <w:t>đặt</w:t>
       </w:r>
       <w:proofErr w:type="spellEnd"/>
       <w:r>
-        <w:t xml:space="preserve"> </w:t>
-      </w:r>
-      <w:proofErr w:type="spellStart"/>
-      <w:r>
+        <w:rPr>
+          <w:rFonts w:cs="Times New Roman"/>
+        </w:rPr>
+        <w:t xml:space="preserve"> </w:t>
+      </w:r>
+      <w:proofErr w:type="spellStart"/>
+      <w:r>
+        <w:rPr>
+          <w:rFonts w:cs="Times New Roman"/>
+        </w:rPr>
         <w:t>StudentService</w:t>
       </w:r>
       <w:proofErr w:type="spellEnd"/>
       <w:r>
+        <w:rPr>
+          <w:rFonts w:cs="Times New Roman"/>
+        </w:rPr>
         <w:t xml:space="preserve"> &amp; </w:t>
       </w:r>
       <w:proofErr w:type="spellStart"/>
       <w:r>
+        <w:rPr>
+          <w:rFonts w:cs="Times New Roman"/>
+        </w:rPr>
         <w:t>DataInitializer</w:t>
       </w:r>
       <w:proofErr w:type="spellEnd"/>
       <w:r>
+        <w:rPr>
+          <w:rFonts w:cs="Times New Roman"/>
+        </w:rPr>
         <w:t xml:space="preserve"> (TODO Cho </w:t>
       </w:r>
       <w:proofErr w:type="spellStart"/>
       <w:r>
+        <w:rPr>
+          <w:rFonts w:cs="Times New Roman"/>
+        </w:rPr>
         <w:t>sẵn</w:t>
       </w:r>
       <w:proofErr w:type="spellEnd"/>
       <w:r>
+        <w:rPr>
+          <w:rFonts w:cs="Times New Roman"/>
+        </w:rPr>
         <w:t>)</w:t>
       </w:r>
       <w:bookmarkEnd w:id="9"/>
@@ -11223,6 +11660,7 @@
         <w:spacing w:after="80"/>
         <w:jc w:val="both"/>
         <w:rPr>
+          <w:rFonts w:ascii="Times New Roman" w:hAnsi="Times New Roman" w:cs="Times New Roman"/>
           <w:sz w:val="24"/>
           <w:szCs w:val="24"/>
         </w:rPr>
@@ -11863,6 +12301,7 @@
         <w:spacing w:after="80"/>
         <w:jc w:val="both"/>
         <w:rPr>
+          <w:rFonts w:ascii="Times New Roman" w:hAnsi="Times New Roman" w:cs="Times New Roman"/>
           <w:sz w:val="24"/>
           <w:szCs w:val="24"/>
         </w:rPr>
@@ -11922,16 +12361,18 @@
         <w:spacing w:before="120" w:after="40"/>
         <w:jc w:val="center"/>
         <w:rPr>
+          <w:rFonts w:ascii="Times New Roman" w:hAnsi="Times New Roman" w:cs="Times New Roman"/>
           <w:sz w:val="24"/>
           <w:szCs w:val="24"/>
         </w:rPr>
       </w:pPr>
       <w:r>
         <w:rPr>
-          <w:sz w:val="24"/>
-          <w:szCs w:val="24"/>
-        </w:rPr>
-        <w:lastRenderedPageBreak/>
+          <w:rFonts w:ascii="Times New Roman" w:hAnsi="Times New Roman" w:cs="Times New Roman"/>
+          <w:noProof/>
+          <w:sz w:val="24"/>
+          <w:szCs w:val="24"/>
+        </w:rPr>
         <w:drawing>
           <wp:inline distT="0" distB="0" distL="0" distR="0" wp14:anchorId="4EBF8AA9" wp14:editId="57EC375E">
             <wp:extent cx="6309360" cy="3211195"/>
@@ -11974,15 +12415,19 @@
         <w:spacing w:before="120" w:after="40"/>
         <w:jc w:val="center"/>
         <w:rPr>
+          <w:rFonts w:ascii="Times New Roman" w:hAnsi="Times New Roman" w:cs="Times New Roman"/>
           <w:sz w:val="24"/>
           <w:szCs w:val="24"/>
         </w:rPr>
       </w:pPr>
       <w:r>
         <w:rPr>
-          <w:sz w:val="24"/>
-          <w:szCs w:val="24"/>
-        </w:rPr>
+          <w:rFonts w:ascii="Times New Roman" w:hAnsi="Times New Roman" w:cs="Times New Roman"/>
+          <w:noProof/>
+          <w:sz w:val="24"/>
+          <w:szCs w:val="24"/>
+        </w:rPr>
+        <w:lastRenderedPageBreak/>
         <w:drawing>
           <wp:inline distT="0" distB="0" distL="0" distR="0" wp14:anchorId="6751EDE2" wp14:editId="5ADDA36B">
             <wp:extent cx="6309360" cy="4243705"/>
@@ -12025,6 +12470,7 @@
         <w:spacing w:after="120"/>
         <w:jc w:val="center"/>
         <w:rPr>
+          <w:rFonts w:ascii="Times New Roman" w:hAnsi="Times New Roman" w:cs="Times New Roman"/>
           <w:sz w:val="24"/>
           <w:szCs w:val="24"/>
         </w:rPr>
@@ -12295,6 +12741,7 @@
         <w:spacing w:after="80"/>
         <w:jc w:val="both"/>
         <w:rPr>
+          <w:rFonts w:ascii="Times New Roman" w:hAnsi="Times New Roman" w:cs="Times New Roman"/>
           <w:sz w:val="24"/>
           <w:szCs w:val="24"/>
         </w:rPr>
@@ -12314,6 +12761,7 @@
         <w:spacing w:after="40"/>
         <w:ind w:left="360"/>
         <w:rPr>
+          <w:rFonts w:ascii="Times New Roman" w:hAnsi="Times New Roman" w:cs="Times New Roman"/>
           <w:sz w:val="24"/>
           <w:szCs w:val="24"/>
         </w:rPr>
@@ -12329,7 +12777,7 @@
       </w:r>
       <w:r>
         <w:rPr>
-          <w:rFonts w:ascii="Consolas" w:hAnsi="Consolas" w:cs="Consolas"/>
+          <w:rFonts w:ascii="Times New Roman" w:hAnsi="Times New Roman" w:cs="Times New Roman"/>
           <w:sz w:val="24"/>
           <w:szCs w:val="24"/>
         </w:rPr>
@@ -12338,7 +12786,7 @@
       <w:proofErr w:type="spellStart"/>
       <w:r>
         <w:rPr>
-          <w:rFonts w:ascii="Consolas" w:hAnsi="Consolas" w:cs="Consolas"/>
+          <w:rFonts w:ascii="Times New Roman" w:hAnsi="Times New Roman" w:cs="Times New Roman"/>
           <w:sz w:val="24"/>
           <w:szCs w:val="24"/>
         </w:rPr>
@@ -12347,7 +12795,7 @@
       <w:proofErr w:type="spellEnd"/>
       <w:r>
         <w:rPr>
-          <w:rFonts w:ascii="Consolas" w:hAnsi="Consolas" w:cs="Consolas"/>
+          <w:rFonts w:ascii="Times New Roman" w:hAnsi="Times New Roman" w:cs="Times New Roman"/>
           <w:sz w:val="24"/>
           <w:szCs w:val="24"/>
         </w:rPr>
@@ -12356,7 +12804,7 @@
       <w:proofErr w:type="spellStart"/>
       <w:r>
         <w:rPr>
-          <w:rFonts w:ascii="Consolas" w:hAnsi="Consolas" w:cs="Consolas"/>
+          <w:rFonts w:ascii="Times New Roman" w:hAnsi="Times New Roman" w:cs="Times New Roman"/>
           <w:sz w:val="24"/>
           <w:szCs w:val="24"/>
         </w:rPr>
@@ -12365,7 +12813,7 @@
       <w:proofErr w:type="spellEnd"/>
       <w:r>
         <w:rPr>
-          <w:rFonts w:ascii="Consolas" w:hAnsi="Consolas" w:cs="Consolas"/>
+          <w:rFonts w:ascii="Times New Roman" w:hAnsi="Times New Roman" w:cs="Times New Roman"/>
           <w:sz w:val="24"/>
           <w:szCs w:val="24"/>
         </w:rPr>
@@ -12377,6 +12825,7 @@
         <w:spacing w:after="80"/>
         <w:jc w:val="both"/>
         <w:rPr>
+          <w:rFonts w:ascii="Times New Roman" w:hAnsi="Times New Roman" w:cs="Times New Roman"/>
           <w:sz w:val="24"/>
           <w:szCs w:val="24"/>
         </w:rPr>
@@ -12396,18 +12845,18 @@
         <w:spacing w:after="40"/>
         <w:ind w:left="360"/>
         <w:rPr>
+          <w:rFonts w:ascii="Times New Roman" w:hAnsi="Times New Roman" w:cs="Times New Roman"/>
           <w:sz w:val="24"/>
           <w:szCs w:val="24"/>
         </w:rPr>
       </w:pPr>
       <w:r>
         <w:rPr>
-          <w:rFonts w:ascii="Consolas" w:hAnsi="Consolas" w:cs="Consolas"/>
+          <w:rFonts w:ascii="Times New Roman" w:hAnsi="Times New Roman" w:cs="Times New Roman"/>
           <w:b/>
           <w:sz w:val="24"/>
           <w:szCs w:val="24"/>
         </w:rPr>
-        <w:lastRenderedPageBreak/>
         <w:t xml:space="preserve">[x] </w:t>
       </w:r>
       <w:proofErr w:type="spellStart"/>
@@ -12704,13 +13153,14 @@
         <w:spacing w:after="40"/>
         <w:ind w:left="360"/>
         <w:rPr>
+          <w:rFonts w:ascii="Times New Roman" w:hAnsi="Times New Roman" w:cs="Times New Roman"/>
           <w:sz w:val="24"/>
           <w:szCs w:val="24"/>
         </w:rPr>
       </w:pPr>
       <w:r>
         <w:rPr>
-          <w:rFonts w:ascii="Consolas" w:hAnsi="Consolas" w:cs="Consolas"/>
+          <w:rFonts w:ascii="Times New Roman" w:hAnsi="Times New Roman" w:cs="Times New Roman"/>
           <w:b/>
           <w:sz w:val="24"/>
           <w:szCs w:val="24"/>
@@ -13001,13 +13451,14 @@
         <w:spacing w:after="40"/>
         <w:ind w:left="360"/>
         <w:rPr>
+          <w:rFonts w:ascii="Times New Roman" w:hAnsi="Times New Roman" w:cs="Times New Roman"/>
           <w:sz w:val="24"/>
           <w:szCs w:val="24"/>
         </w:rPr>
       </w:pPr>
       <w:r>
         <w:rPr>
-          <w:rFonts w:ascii="Consolas" w:hAnsi="Consolas" w:cs="Consolas"/>
+          <w:rFonts w:ascii="Times New Roman" w:hAnsi="Times New Roman" w:cs="Times New Roman"/>
           <w:b/>
           <w:sz w:val="24"/>
           <w:szCs w:val="24"/>
@@ -13342,25 +13793,43 @@
     <w:p>
       <w:pPr>
         <w:pStyle w:val="Heading1"/>
+        <w:rPr>
+          <w:rFonts w:cs="Times New Roman"/>
+        </w:rPr>
       </w:pPr>
       <w:bookmarkStart w:id="10" w:name="_Toc243839305"/>
       <w:r>
+        <w:rPr>
+          <w:rFonts w:cs="Times New Roman"/>
+        </w:rPr>
         <w:t xml:space="preserve">Controller &amp; Giao </w:t>
       </w:r>
       <w:proofErr w:type="spellStart"/>
       <w:r>
+        <w:rPr>
+          <w:rFonts w:cs="Times New Roman"/>
+        </w:rPr>
         <w:t>diện</w:t>
       </w:r>
       <w:proofErr w:type="spellEnd"/>
       <w:r>
-        <w:t xml:space="preserve"> </w:t>
-      </w:r>
-      <w:proofErr w:type="spellStart"/>
-      <w:r>
+        <w:rPr>
+          <w:rFonts w:cs="Times New Roman"/>
+        </w:rPr>
+        <w:t xml:space="preserve"> </w:t>
+      </w:r>
+      <w:proofErr w:type="spellStart"/>
+      <w:r>
+        <w:rPr>
+          <w:rFonts w:cs="Times New Roman"/>
+        </w:rPr>
         <w:t>Thymeleaf</w:t>
       </w:r>
       <w:proofErr w:type="spellEnd"/>
       <w:r>
+        <w:rPr>
+          <w:rFonts w:cs="Times New Roman"/>
+        </w:rPr>
         <w:t xml:space="preserve"> (STEP 8 – 12)</w:t>
       </w:r>
       <w:bookmarkEnd w:id="10"/>
@@ -13368,41 +13837,71 @@
     <w:p>
       <w:pPr>
         <w:pStyle w:val="Heading2"/>
+        <w:rPr>
+          <w:rFonts w:cs="Times New Roman"/>
+        </w:rPr>
       </w:pPr>
       <w:bookmarkStart w:id="11" w:name="_Toc243839306"/>
       <w:r>
+        <w:rPr>
+          <w:rFonts w:cs="Times New Roman"/>
+        </w:rPr>
         <w:t xml:space="preserve">STEP 8 — </w:t>
       </w:r>
       <w:proofErr w:type="spellStart"/>
       <w:r>
+        <w:rPr>
+          <w:rFonts w:cs="Times New Roman"/>
+        </w:rPr>
         <w:t>Xây</w:t>
       </w:r>
       <w:proofErr w:type="spellEnd"/>
       <w:r>
-        <w:t xml:space="preserve"> </w:t>
-      </w:r>
-      <w:proofErr w:type="spellStart"/>
-      <w:r>
+        <w:rPr>
+          <w:rFonts w:cs="Times New Roman"/>
+        </w:rPr>
+        <w:t xml:space="preserve"> </w:t>
+      </w:r>
+      <w:proofErr w:type="spellStart"/>
+      <w:r>
+        <w:rPr>
+          <w:rFonts w:cs="Times New Roman"/>
+        </w:rPr>
         <w:t>dựng</w:t>
       </w:r>
       <w:proofErr w:type="spellEnd"/>
       <w:r>
+        <w:rPr>
+          <w:rFonts w:cs="Times New Roman"/>
+        </w:rPr>
         <w:t xml:space="preserve"> Controller </w:t>
       </w:r>
       <w:proofErr w:type="spellStart"/>
       <w:r>
+        <w:rPr>
+          <w:rFonts w:cs="Times New Roman"/>
+        </w:rPr>
         <w:t>điều</w:t>
       </w:r>
       <w:proofErr w:type="spellEnd"/>
       <w:r>
-        <w:t xml:space="preserve"> </w:t>
-      </w:r>
-      <w:proofErr w:type="spellStart"/>
-      <w:r>
+        <w:rPr>
+          <w:rFonts w:cs="Times New Roman"/>
+        </w:rPr>
+        <w:t xml:space="preserve"> </w:t>
+      </w:r>
+      <w:proofErr w:type="spellStart"/>
+      <w:r>
+        <w:rPr>
+          <w:rFonts w:cs="Times New Roman"/>
+        </w:rPr>
         <w:t>hướng</w:t>
       </w:r>
       <w:proofErr w:type="spellEnd"/>
       <w:r>
+        <w:rPr>
+          <w:rFonts w:cs="Times New Roman"/>
+        </w:rPr>
         <w:t xml:space="preserve"> &amp; CRUD (TODO 4 – 7)</w:t>
       </w:r>
       <w:bookmarkEnd w:id="11"/>
@@ -13412,6 +13911,7 @@
         <w:spacing w:after="80"/>
         <w:jc w:val="both"/>
         <w:rPr>
+          <w:rFonts w:ascii="Times New Roman" w:hAnsi="Times New Roman" w:cs="Times New Roman"/>
           <w:sz w:val="24"/>
           <w:szCs w:val="24"/>
         </w:rPr>
@@ -14160,6 +14660,7 @@
         <w:spacing w:after="80"/>
         <w:jc w:val="both"/>
         <w:rPr>
+          <w:rFonts w:ascii="Times New Roman" w:hAnsi="Times New Roman" w:cs="Times New Roman"/>
           <w:sz w:val="24"/>
           <w:szCs w:val="24"/>
         </w:rPr>
@@ -14219,15 +14720,19 @@
         <w:spacing w:before="120" w:after="40"/>
         <w:jc w:val="center"/>
         <w:rPr>
+          <w:rFonts w:ascii="Times New Roman" w:hAnsi="Times New Roman" w:cs="Times New Roman"/>
           <w:sz w:val="24"/>
           <w:szCs w:val="24"/>
         </w:rPr>
       </w:pPr>
       <w:r>
         <w:rPr>
-          <w:sz w:val="24"/>
-          <w:szCs w:val="24"/>
-        </w:rPr>
+          <w:rFonts w:ascii="Times New Roman" w:hAnsi="Times New Roman" w:cs="Times New Roman"/>
+          <w:noProof/>
+          <w:sz w:val="24"/>
+          <w:szCs w:val="24"/>
+        </w:rPr>
+        <w:lastRenderedPageBreak/>
         <w:drawing>
           <wp:inline distT="0" distB="0" distL="0" distR="0" wp14:anchorId="16E623EB" wp14:editId="6EABDD04">
             <wp:extent cx="6309360" cy="4648835"/>
@@ -14270,12 +14775,15 @@
         <w:spacing w:before="120" w:after="40"/>
         <w:jc w:val="center"/>
         <w:rPr>
+          <w:rFonts w:ascii="Times New Roman" w:hAnsi="Times New Roman" w:cs="Times New Roman"/>
           <w:sz w:val="24"/>
           <w:szCs w:val="24"/>
         </w:rPr>
       </w:pPr>
       <w:r>
         <w:rPr>
+          <w:rFonts w:ascii="Times New Roman" w:hAnsi="Times New Roman" w:cs="Times New Roman"/>
+          <w:noProof/>
           <w:sz w:val="24"/>
           <w:szCs w:val="24"/>
         </w:rPr>
@@ -14322,6 +14830,7 @@
         <w:spacing w:after="120"/>
         <w:jc w:val="center"/>
         <w:rPr>
+          <w:rFonts w:ascii="Times New Roman" w:hAnsi="Times New Roman" w:cs="Times New Roman"/>
           <w:sz w:val="24"/>
           <w:szCs w:val="24"/>
         </w:rPr>
@@ -14612,6 +15121,7 @@
         <w:spacing w:after="80"/>
         <w:jc w:val="both"/>
         <w:rPr>
+          <w:rFonts w:ascii="Times New Roman" w:hAnsi="Times New Roman" w:cs="Times New Roman"/>
           <w:sz w:val="24"/>
           <w:szCs w:val="24"/>
         </w:rPr>
@@ -14631,6 +15141,7 @@
         <w:spacing w:after="40"/>
         <w:ind w:left="360"/>
         <w:rPr>
+          <w:rFonts w:ascii="Times New Roman" w:hAnsi="Times New Roman" w:cs="Times New Roman"/>
           <w:sz w:val="24"/>
           <w:szCs w:val="24"/>
         </w:rPr>
@@ -14646,7 +15157,7 @@
       </w:r>
       <w:r>
         <w:rPr>
-          <w:rFonts w:ascii="Consolas" w:hAnsi="Consolas" w:cs="Consolas"/>
+          <w:rFonts w:ascii="Times New Roman" w:hAnsi="Times New Roman" w:cs="Times New Roman"/>
           <w:sz w:val="24"/>
           <w:szCs w:val="24"/>
         </w:rPr>
@@ -14655,7 +15166,7 @@
       <w:proofErr w:type="spellStart"/>
       <w:r>
         <w:rPr>
-          <w:rFonts w:ascii="Consolas" w:hAnsi="Consolas" w:cs="Consolas"/>
+          <w:rFonts w:ascii="Times New Roman" w:hAnsi="Times New Roman" w:cs="Times New Roman"/>
           <w:sz w:val="24"/>
           <w:szCs w:val="24"/>
         </w:rPr>
@@ -14664,7 +15175,7 @@
       <w:proofErr w:type="spellEnd"/>
       <w:r>
         <w:rPr>
-          <w:rFonts w:ascii="Consolas" w:hAnsi="Consolas" w:cs="Consolas"/>
+          <w:rFonts w:ascii="Times New Roman" w:hAnsi="Times New Roman" w:cs="Times New Roman"/>
           <w:sz w:val="24"/>
           <w:szCs w:val="24"/>
         </w:rPr>
@@ -14676,6 +15187,7 @@
         <w:spacing w:after="80"/>
         <w:jc w:val="both"/>
         <w:rPr>
+          <w:rFonts w:ascii="Times New Roman" w:hAnsi="Times New Roman" w:cs="Times New Roman"/>
           <w:sz w:val="24"/>
           <w:szCs w:val="24"/>
         </w:rPr>
@@ -14695,13 +15207,14 @@
         <w:spacing w:after="40"/>
         <w:ind w:left="360"/>
         <w:rPr>
+          <w:rFonts w:ascii="Times New Roman" w:hAnsi="Times New Roman" w:cs="Times New Roman"/>
           <w:sz w:val="24"/>
           <w:szCs w:val="24"/>
         </w:rPr>
       </w:pPr>
       <w:r>
         <w:rPr>
-          <w:rFonts w:ascii="Consolas" w:hAnsi="Consolas" w:cs="Consolas"/>
+          <w:rFonts w:ascii="Times New Roman" w:hAnsi="Times New Roman" w:cs="Times New Roman"/>
           <w:b/>
           <w:sz w:val="24"/>
           <w:szCs w:val="24"/>
@@ -14830,13 +15343,14 @@
         <w:spacing w:after="40"/>
         <w:ind w:left="360"/>
         <w:rPr>
+          <w:rFonts w:ascii="Times New Roman" w:hAnsi="Times New Roman" w:cs="Times New Roman"/>
           <w:sz w:val="24"/>
           <w:szCs w:val="24"/>
         </w:rPr>
       </w:pPr>
       <w:r>
         <w:rPr>
-          <w:rFonts w:ascii="Consolas" w:hAnsi="Consolas" w:cs="Consolas"/>
+          <w:rFonts w:ascii="Times New Roman" w:hAnsi="Times New Roman" w:cs="Times New Roman"/>
           <w:b/>
           <w:sz w:val="24"/>
           <w:szCs w:val="24"/>
@@ -15119,13 +15633,14 @@
         <w:spacing w:after="40"/>
         <w:ind w:left="360"/>
         <w:rPr>
+          <w:rFonts w:ascii="Times New Roman" w:hAnsi="Times New Roman" w:cs="Times New Roman"/>
           <w:sz w:val="24"/>
           <w:szCs w:val="24"/>
         </w:rPr>
       </w:pPr>
       <w:r>
         <w:rPr>
-          <w:rFonts w:ascii="Consolas" w:hAnsi="Consolas" w:cs="Consolas"/>
+          <w:rFonts w:ascii="Times New Roman" w:hAnsi="Times New Roman" w:cs="Times New Roman"/>
           <w:b/>
           <w:sz w:val="24"/>
           <w:szCs w:val="24"/>
@@ -15371,6 +15886,7 @@
       <w:pPr>
         <w:spacing w:after="80"/>
         <w:rPr>
+          <w:rFonts w:ascii="Times New Roman" w:hAnsi="Times New Roman" w:cs="Times New Roman"/>
           <w:sz w:val="24"/>
           <w:szCs w:val="24"/>
         </w:rPr>
@@ -15379,33 +15895,57 @@
     <w:p>
       <w:pPr>
         <w:pStyle w:val="Heading2"/>
+        <w:rPr>
+          <w:rFonts w:cs="Times New Roman"/>
+        </w:rPr>
       </w:pPr>
       <w:bookmarkStart w:id="12" w:name="_Toc243839307"/>
       <w:r>
+        <w:rPr>
+          <w:rFonts w:cs="Times New Roman"/>
+        </w:rPr>
         <w:t xml:space="preserve">STEP 9 — </w:t>
       </w:r>
       <w:proofErr w:type="spellStart"/>
       <w:r>
+        <w:rPr>
+          <w:rFonts w:cs="Times New Roman"/>
+        </w:rPr>
         <w:t>Xây</w:t>
       </w:r>
       <w:proofErr w:type="spellEnd"/>
       <w:r>
-        <w:t xml:space="preserve"> </w:t>
-      </w:r>
-      <w:proofErr w:type="spellStart"/>
-      <w:r>
+        <w:rPr>
+          <w:rFonts w:cs="Times New Roman"/>
+        </w:rPr>
+        <w:t xml:space="preserve"> </w:t>
+      </w:r>
+      <w:proofErr w:type="spellStart"/>
+      <w:r>
+        <w:rPr>
+          <w:rFonts w:cs="Times New Roman"/>
+        </w:rPr>
         <w:t>dựng</w:t>
       </w:r>
       <w:proofErr w:type="spellEnd"/>
       <w:r>
+        <w:rPr>
+          <w:rFonts w:cs="Times New Roman"/>
+        </w:rPr>
         <w:t xml:space="preserve"> Layout Template </w:t>
       </w:r>
       <w:proofErr w:type="spellStart"/>
       <w:r>
+        <w:rPr>
+          <w:rFonts w:cs="Times New Roman"/>
+        </w:rPr>
         <w:t>chung</w:t>
       </w:r>
       <w:proofErr w:type="spellEnd"/>
       <w:r>
+        <w:rPr>
+          <w:rFonts w:cs="Times New Roman"/>
+        </w:rPr>
         <w:t xml:space="preserve"> (TODO 8)</w:t>
       </w:r>
       <w:bookmarkEnd w:id="12"/>
@@ -15415,6 +15955,7 @@
         <w:spacing w:after="80"/>
         <w:jc w:val="both"/>
         <w:rPr>
+          <w:rFonts w:ascii="Times New Roman" w:hAnsi="Times New Roman" w:cs="Times New Roman"/>
           <w:sz w:val="24"/>
           <w:szCs w:val="24"/>
         </w:rPr>
@@ -16087,6 +16628,7 @@
         <w:spacing w:after="80"/>
         <w:jc w:val="both"/>
         <w:rPr>
+          <w:rFonts w:ascii="Times New Roman" w:hAnsi="Times New Roman" w:cs="Times New Roman"/>
           <w:sz w:val="24"/>
           <w:szCs w:val="24"/>
         </w:rPr>
@@ -16146,12 +16688,15 @@
         <w:spacing w:before="120" w:after="40"/>
         <w:jc w:val="center"/>
         <w:rPr>
+          <w:rFonts w:ascii="Times New Roman" w:hAnsi="Times New Roman" w:cs="Times New Roman"/>
           <w:sz w:val="24"/>
           <w:szCs w:val="24"/>
         </w:rPr>
       </w:pPr>
       <w:r>
         <w:rPr>
+          <w:rFonts w:ascii="Times New Roman" w:hAnsi="Times New Roman" w:cs="Times New Roman"/>
+          <w:noProof/>
           <w:sz w:val="24"/>
           <w:szCs w:val="24"/>
         </w:rPr>
@@ -16198,12 +16743,15 @@
         <w:spacing w:before="120" w:after="40"/>
         <w:jc w:val="center"/>
         <w:rPr>
+          <w:rFonts w:ascii="Times New Roman" w:hAnsi="Times New Roman" w:cs="Times New Roman"/>
           <w:sz w:val="24"/>
           <w:szCs w:val="24"/>
         </w:rPr>
       </w:pPr>
       <w:r>
         <w:rPr>
+          <w:rFonts w:ascii="Times New Roman" w:hAnsi="Times New Roman" w:cs="Times New Roman"/>
+          <w:noProof/>
           <w:sz w:val="24"/>
           <w:szCs w:val="24"/>
         </w:rPr>
@@ -16249,6 +16797,7 @@
         <w:spacing w:after="120"/>
         <w:jc w:val="center"/>
         <w:rPr>
+          <w:rFonts w:ascii="Times New Roman" w:hAnsi="Times New Roman" w:cs="Times New Roman"/>
           <w:sz w:val="24"/>
           <w:szCs w:val="24"/>
         </w:rPr>
@@ -16439,6 +16988,7 @@
         <w:spacing w:after="80"/>
         <w:jc w:val="both"/>
         <w:rPr>
+          <w:rFonts w:ascii="Times New Roman" w:hAnsi="Times New Roman" w:cs="Times New Roman"/>
           <w:sz w:val="24"/>
           <w:szCs w:val="24"/>
         </w:rPr>
@@ -16459,6 +17009,7 @@
         <w:spacing w:after="40"/>
         <w:ind w:left="360"/>
         <w:rPr>
+          <w:rFonts w:ascii="Times New Roman" w:hAnsi="Times New Roman" w:cs="Times New Roman"/>
           <w:sz w:val="24"/>
           <w:szCs w:val="24"/>
         </w:rPr>
@@ -16474,7 +17025,7 @@
       </w:r>
       <w:r>
         <w:rPr>
-          <w:rFonts w:ascii="Consolas" w:hAnsi="Consolas" w:cs="Consolas"/>
+          <w:rFonts w:ascii="Times New Roman" w:hAnsi="Times New Roman" w:cs="Times New Roman"/>
           <w:sz w:val="24"/>
           <w:szCs w:val="24"/>
         </w:rPr>
@@ -16486,6 +17037,7 @@
         <w:spacing w:after="80"/>
         <w:jc w:val="both"/>
         <w:rPr>
+          <w:rFonts w:ascii="Times New Roman" w:hAnsi="Times New Roman" w:cs="Times New Roman"/>
           <w:sz w:val="24"/>
           <w:szCs w:val="24"/>
         </w:rPr>
@@ -16505,13 +17057,14 @@
         <w:spacing w:after="40"/>
         <w:ind w:left="360"/>
         <w:rPr>
+          <w:rFonts w:ascii="Times New Roman" w:hAnsi="Times New Roman" w:cs="Times New Roman"/>
           <w:sz w:val="24"/>
           <w:szCs w:val="24"/>
         </w:rPr>
       </w:pPr>
       <w:r>
         <w:rPr>
-          <w:rFonts w:ascii="Consolas" w:hAnsi="Consolas" w:cs="Consolas"/>
+          <w:rFonts w:ascii="Times New Roman" w:hAnsi="Times New Roman" w:cs="Times New Roman"/>
           <w:b/>
           <w:sz w:val="24"/>
           <w:szCs w:val="24"/>
@@ -16670,13 +17223,14 @@
         <w:spacing w:after="40"/>
         <w:ind w:left="360"/>
         <w:rPr>
+          <w:rFonts w:ascii="Times New Roman" w:hAnsi="Times New Roman" w:cs="Times New Roman"/>
           <w:sz w:val="24"/>
           <w:szCs w:val="24"/>
         </w:rPr>
       </w:pPr>
       <w:r>
         <w:rPr>
-          <w:rFonts w:ascii="Consolas" w:hAnsi="Consolas" w:cs="Consolas"/>
+          <w:rFonts w:ascii="Times New Roman" w:hAnsi="Times New Roman" w:cs="Times New Roman"/>
           <w:b/>
           <w:sz w:val="24"/>
           <w:szCs w:val="24"/>
@@ -16859,13 +17413,14 @@
         <w:spacing w:after="40"/>
         <w:ind w:left="360"/>
         <w:rPr>
+          <w:rFonts w:ascii="Times New Roman" w:hAnsi="Times New Roman" w:cs="Times New Roman"/>
           <w:sz w:val="24"/>
           <w:szCs w:val="24"/>
         </w:rPr>
       </w:pPr>
       <w:r>
         <w:rPr>
-          <w:rFonts w:ascii="Consolas" w:hAnsi="Consolas" w:cs="Consolas"/>
+          <w:rFonts w:ascii="Times New Roman" w:hAnsi="Times New Roman" w:cs="Times New Roman"/>
           <w:b/>
           <w:sz w:val="24"/>
           <w:szCs w:val="24"/>
@@ -17076,13 +17631,14 @@
         <w:spacing w:after="40"/>
         <w:ind w:left="360"/>
         <w:rPr>
+          <w:rFonts w:ascii="Times New Roman" w:hAnsi="Times New Roman" w:cs="Times New Roman"/>
           <w:sz w:val="24"/>
           <w:szCs w:val="24"/>
         </w:rPr>
       </w:pPr>
       <w:r>
         <w:rPr>
-          <w:rFonts w:ascii="Consolas" w:hAnsi="Consolas" w:cs="Consolas"/>
+          <w:rFonts w:ascii="Times New Roman" w:hAnsi="Times New Roman" w:cs="Times New Roman"/>
           <w:b/>
           <w:sz w:val="24"/>
           <w:szCs w:val="24"/>
@@ -17336,6 +17892,7 @@
       <w:pPr>
         <w:spacing w:after="80"/>
         <w:rPr>
+          <w:rFonts w:ascii="Times New Roman" w:hAnsi="Times New Roman" w:cs="Times New Roman"/>
           <w:sz w:val="24"/>
           <w:szCs w:val="24"/>
         </w:rPr>
@@ -17344,57 +17901,99 @@
     <w:p>
       <w:pPr>
         <w:pStyle w:val="Heading2"/>
+        <w:rPr>
+          <w:rFonts w:cs="Times New Roman"/>
+        </w:rPr>
       </w:pPr>
       <w:bookmarkStart w:id="13" w:name="_Toc243839308"/>
       <w:r>
+        <w:rPr>
+          <w:rFonts w:cs="Times New Roman"/>
+        </w:rPr>
         <w:t xml:space="preserve">STEP 10 — </w:t>
       </w:r>
       <w:proofErr w:type="spellStart"/>
       <w:r>
+        <w:rPr>
+          <w:rFonts w:cs="Times New Roman"/>
+        </w:rPr>
         <w:t>Xây</w:t>
       </w:r>
       <w:proofErr w:type="spellEnd"/>
       <w:r>
-        <w:t xml:space="preserve"> </w:t>
-      </w:r>
-      <w:proofErr w:type="spellStart"/>
-      <w:r>
+        <w:rPr>
+          <w:rFonts w:cs="Times New Roman"/>
+        </w:rPr>
+        <w:t xml:space="preserve"> </w:t>
+      </w:r>
+      <w:proofErr w:type="spellStart"/>
+      <w:r>
+        <w:rPr>
+          <w:rFonts w:cs="Times New Roman"/>
+        </w:rPr>
         <w:t>dựng</w:t>
       </w:r>
       <w:proofErr w:type="spellEnd"/>
       <w:r>
+        <w:rPr>
+          <w:rFonts w:cs="Times New Roman"/>
+        </w:rPr>
         <w:t xml:space="preserve"> Trang </w:t>
       </w:r>
       <w:proofErr w:type="spellStart"/>
       <w:r>
+        <w:rPr>
+          <w:rFonts w:cs="Times New Roman"/>
+        </w:rPr>
         <w:t>danh</w:t>
       </w:r>
       <w:proofErr w:type="spellEnd"/>
       <w:r>
-        <w:t xml:space="preserve"> </w:t>
-      </w:r>
-      <w:proofErr w:type="spellStart"/>
-      <w:r>
+        <w:rPr>
+          <w:rFonts w:cs="Times New Roman"/>
+        </w:rPr>
+        <w:t xml:space="preserve"> </w:t>
+      </w:r>
+      <w:proofErr w:type="spellStart"/>
+      <w:r>
+        <w:rPr>
+          <w:rFonts w:cs="Times New Roman"/>
+        </w:rPr>
         <w:t>sách</w:t>
       </w:r>
       <w:proofErr w:type="spellEnd"/>
       <w:r>
-        <w:t xml:space="preserve"> </w:t>
-      </w:r>
-      <w:proofErr w:type="spellStart"/>
-      <w:r>
+        <w:rPr>
+          <w:rFonts w:cs="Times New Roman"/>
+        </w:rPr>
+        <w:t xml:space="preserve"> </w:t>
+      </w:r>
+      <w:proofErr w:type="spellStart"/>
+      <w:r>
+        <w:rPr>
+          <w:rFonts w:cs="Times New Roman"/>
+        </w:rPr>
         <w:t>sinh</w:t>
       </w:r>
       <w:proofErr w:type="spellEnd"/>
       <w:r>
-        <w:t xml:space="preserve"> </w:t>
-      </w:r>
-      <w:proofErr w:type="spellStart"/>
-      <w:r>
+        <w:rPr>
+          <w:rFonts w:cs="Times New Roman"/>
+        </w:rPr>
+        <w:t xml:space="preserve"> </w:t>
+      </w:r>
+      <w:proofErr w:type="spellStart"/>
+      <w:r>
+        <w:rPr>
+          <w:rFonts w:cs="Times New Roman"/>
+        </w:rPr>
         <w:t>viên</w:t>
       </w:r>
       <w:proofErr w:type="spellEnd"/>
       <w:r>
+        <w:rPr>
+          <w:rFonts w:cs="Times New Roman"/>
+        </w:rPr>
         <w:t xml:space="preserve"> (TODO 9 – 13)</w:t>
       </w:r>
       <w:bookmarkEnd w:id="13"/>
@@ -17404,6 +18003,7 @@
         <w:spacing w:after="80"/>
         <w:jc w:val="both"/>
         <w:rPr>
+          <w:rFonts w:ascii="Times New Roman" w:hAnsi="Times New Roman" w:cs="Times New Roman"/>
           <w:sz w:val="24"/>
           <w:szCs w:val="24"/>
         </w:rPr>
@@ -18290,6 +18890,7 @@
         <w:spacing w:after="80"/>
         <w:jc w:val="both"/>
         <w:rPr>
+          <w:rFonts w:ascii="Times New Roman" w:hAnsi="Times New Roman" w:cs="Times New Roman"/>
           <w:sz w:val="24"/>
           <w:szCs w:val="24"/>
         </w:rPr>
@@ -18349,12 +18950,15 @@
         <w:spacing w:before="120" w:after="40"/>
         <w:jc w:val="center"/>
         <w:rPr>
+          <w:rFonts w:ascii="Times New Roman" w:hAnsi="Times New Roman" w:cs="Times New Roman"/>
           <w:sz w:val="24"/>
           <w:szCs w:val="24"/>
         </w:rPr>
       </w:pPr>
       <w:r>
         <w:rPr>
+          <w:rFonts w:ascii="Times New Roman" w:hAnsi="Times New Roman" w:cs="Times New Roman"/>
+          <w:noProof/>
           <w:sz w:val="24"/>
           <w:szCs w:val="24"/>
         </w:rPr>
@@ -18400,6 +19004,7 @@
         <w:spacing w:after="120"/>
         <w:jc w:val="center"/>
         <w:rPr>
+          <w:rFonts w:ascii="Times New Roman" w:hAnsi="Times New Roman" w:cs="Times New Roman"/>
           <w:sz w:val="24"/>
           <w:szCs w:val="24"/>
         </w:rPr>
@@ -18710,12 +19315,15 @@
         <w:spacing w:before="120" w:after="40"/>
         <w:jc w:val="center"/>
         <w:rPr>
+          <w:rFonts w:ascii="Times New Roman" w:hAnsi="Times New Roman" w:cs="Times New Roman"/>
           <w:sz w:val="24"/>
           <w:szCs w:val="24"/>
         </w:rPr>
       </w:pPr>
       <w:r>
         <w:rPr>
+          <w:rFonts w:ascii="Times New Roman" w:hAnsi="Times New Roman" w:cs="Times New Roman"/>
+          <w:noProof/>
           <w:sz w:val="24"/>
           <w:szCs w:val="24"/>
         </w:rPr>
@@ -18762,6 +19370,7 @@
         <w:spacing w:after="120"/>
         <w:jc w:val="center"/>
         <w:rPr>
+          <w:rFonts w:ascii="Times New Roman" w:hAnsi="Times New Roman" w:cs="Times New Roman"/>
           <w:sz w:val="24"/>
           <w:szCs w:val="24"/>
         </w:rPr>
@@ -19041,6 +19650,7 @@
         <w:spacing w:after="80"/>
         <w:jc w:val="both"/>
         <w:rPr>
+          <w:rFonts w:ascii="Times New Roman" w:hAnsi="Times New Roman" w:cs="Times New Roman"/>
           <w:sz w:val="24"/>
           <w:szCs w:val="24"/>
         </w:rPr>
@@ -19060,6 +19670,7 @@
         <w:spacing w:after="40"/>
         <w:ind w:left="360"/>
         <w:rPr>
+          <w:rFonts w:ascii="Times New Roman" w:hAnsi="Times New Roman" w:cs="Times New Roman"/>
           <w:sz w:val="24"/>
           <w:szCs w:val="24"/>
         </w:rPr>
@@ -19075,7 +19686,7 @@
       </w:r>
       <w:r>
         <w:rPr>
-          <w:rFonts w:ascii="Consolas" w:hAnsi="Consolas" w:cs="Consolas"/>
+          <w:rFonts w:ascii="Times New Roman" w:hAnsi="Times New Roman" w:cs="Times New Roman"/>
           <w:sz w:val="24"/>
           <w:szCs w:val="24"/>
         </w:rPr>
@@ -19087,6 +19698,7 @@
         <w:spacing w:after="80"/>
         <w:jc w:val="both"/>
         <w:rPr>
+          <w:rFonts w:ascii="Times New Roman" w:hAnsi="Times New Roman" w:cs="Times New Roman"/>
           <w:sz w:val="24"/>
           <w:szCs w:val="24"/>
         </w:rPr>
@@ -19106,13 +19718,14 @@
         <w:spacing w:after="40"/>
         <w:ind w:left="360"/>
         <w:rPr>
+          <w:rFonts w:ascii="Times New Roman" w:hAnsi="Times New Roman" w:cs="Times New Roman"/>
           <w:sz w:val="24"/>
           <w:szCs w:val="24"/>
         </w:rPr>
       </w:pPr>
       <w:r>
         <w:rPr>
-          <w:rFonts w:ascii="Consolas" w:hAnsi="Consolas" w:cs="Consolas"/>
+          <w:rFonts w:ascii="Times New Roman" w:hAnsi="Times New Roman" w:cs="Times New Roman"/>
           <w:b/>
           <w:sz w:val="24"/>
           <w:szCs w:val="24"/>
@@ -19313,13 +19926,14 @@
         <w:spacing w:after="40"/>
         <w:ind w:left="360"/>
         <w:rPr>
+          <w:rFonts w:ascii="Times New Roman" w:hAnsi="Times New Roman" w:cs="Times New Roman"/>
           <w:sz w:val="24"/>
           <w:szCs w:val="24"/>
         </w:rPr>
       </w:pPr>
       <w:r>
         <w:rPr>
-          <w:rFonts w:ascii="Consolas" w:hAnsi="Consolas" w:cs="Consolas"/>
+          <w:rFonts w:ascii="Times New Roman" w:hAnsi="Times New Roman" w:cs="Times New Roman"/>
           <w:b/>
           <w:sz w:val="24"/>
           <w:szCs w:val="24"/>
@@ -19646,13 +20260,14 @@
         <w:spacing w:after="40"/>
         <w:ind w:left="360"/>
         <w:rPr>
+          <w:rFonts w:ascii="Times New Roman" w:hAnsi="Times New Roman" w:cs="Times New Roman"/>
           <w:sz w:val="24"/>
           <w:szCs w:val="24"/>
         </w:rPr>
       </w:pPr>
       <w:r>
         <w:rPr>
-          <w:rFonts w:ascii="Consolas" w:hAnsi="Consolas" w:cs="Consolas"/>
+          <w:rFonts w:ascii="Times New Roman" w:hAnsi="Times New Roman" w:cs="Times New Roman"/>
           <w:b/>
           <w:sz w:val="24"/>
           <w:szCs w:val="24"/>
@@ -19853,13 +20468,14 @@
         <w:spacing w:after="40"/>
         <w:ind w:left="360"/>
         <w:rPr>
+          <w:rFonts w:ascii="Times New Roman" w:hAnsi="Times New Roman" w:cs="Times New Roman"/>
           <w:sz w:val="24"/>
           <w:szCs w:val="24"/>
         </w:rPr>
       </w:pPr>
       <w:r>
         <w:rPr>
-          <w:rFonts w:ascii="Consolas" w:hAnsi="Consolas" w:cs="Consolas"/>
+          <w:rFonts w:ascii="Times New Roman" w:hAnsi="Times New Roman" w:cs="Times New Roman"/>
           <w:b/>
           <w:sz w:val="24"/>
           <w:szCs w:val="24"/>
@@ -20041,6 +20657,7 @@
       <w:pPr>
         <w:spacing w:after="80"/>
         <w:rPr>
+          <w:rFonts w:ascii="Times New Roman" w:hAnsi="Times New Roman" w:cs="Times New Roman"/>
           <w:sz w:val="24"/>
           <w:szCs w:val="24"/>
         </w:rPr>
@@ -20049,49 +20666,85 @@
     <w:p>
       <w:pPr>
         <w:pStyle w:val="Heading2"/>
+        <w:rPr>
+          <w:rFonts w:cs="Times New Roman"/>
+        </w:rPr>
       </w:pPr>
       <w:bookmarkStart w:id="14" w:name="_Toc243839309"/>
       <w:r>
+        <w:rPr>
+          <w:rFonts w:cs="Times New Roman"/>
+        </w:rPr>
         <w:t xml:space="preserve">STEP 11 — </w:t>
       </w:r>
       <w:proofErr w:type="spellStart"/>
       <w:r>
+        <w:rPr>
+          <w:rFonts w:cs="Times New Roman"/>
+        </w:rPr>
         <w:t>Xây</w:t>
       </w:r>
       <w:proofErr w:type="spellEnd"/>
       <w:r>
-        <w:t xml:space="preserve"> </w:t>
-      </w:r>
-      <w:proofErr w:type="spellStart"/>
-      <w:r>
+        <w:rPr>
+          <w:rFonts w:cs="Times New Roman"/>
+        </w:rPr>
+        <w:t xml:space="preserve"> </w:t>
+      </w:r>
+      <w:proofErr w:type="spellStart"/>
+      <w:r>
+        <w:rPr>
+          <w:rFonts w:cs="Times New Roman"/>
+        </w:rPr>
         <w:t>dựng</w:t>
       </w:r>
       <w:proofErr w:type="spellEnd"/>
       <w:r>
+        <w:rPr>
+          <w:rFonts w:cs="Times New Roman"/>
+        </w:rPr>
         <w:t xml:space="preserve"> Trang chi </w:t>
       </w:r>
       <w:proofErr w:type="spellStart"/>
       <w:r>
+        <w:rPr>
+          <w:rFonts w:cs="Times New Roman"/>
+        </w:rPr>
         <w:t>tiết</w:t>
       </w:r>
       <w:proofErr w:type="spellEnd"/>
       <w:r>
-        <w:t xml:space="preserve"> </w:t>
-      </w:r>
-      <w:proofErr w:type="spellStart"/>
-      <w:r>
+        <w:rPr>
+          <w:rFonts w:cs="Times New Roman"/>
+        </w:rPr>
+        <w:t xml:space="preserve"> </w:t>
+      </w:r>
+      <w:proofErr w:type="spellStart"/>
+      <w:r>
+        <w:rPr>
+          <w:rFonts w:cs="Times New Roman"/>
+        </w:rPr>
         <w:t>sinh</w:t>
       </w:r>
       <w:proofErr w:type="spellEnd"/>
       <w:r>
-        <w:t xml:space="preserve"> </w:t>
-      </w:r>
-      <w:proofErr w:type="spellStart"/>
-      <w:r>
+        <w:rPr>
+          <w:rFonts w:cs="Times New Roman"/>
+        </w:rPr>
+        <w:t xml:space="preserve"> </w:t>
+      </w:r>
+      <w:proofErr w:type="spellStart"/>
+      <w:r>
+        <w:rPr>
+          <w:rFonts w:cs="Times New Roman"/>
+        </w:rPr>
         <w:t>viên</w:t>
       </w:r>
       <w:proofErr w:type="spellEnd"/>
       <w:r>
+        <w:rPr>
+          <w:rFonts w:cs="Times New Roman"/>
+        </w:rPr>
         <w:t xml:space="preserve"> (TODO 14)</w:t>
       </w:r>
       <w:bookmarkEnd w:id="14"/>
@@ -20101,6 +20754,7 @@
         <w:spacing w:after="80"/>
         <w:jc w:val="both"/>
         <w:rPr>
+          <w:rFonts w:ascii="Times New Roman" w:hAnsi="Times New Roman" w:cs="Times New Roman"/>
           <w:sz w:val="24"/>
           <w:szCs w:val="24"/>
         </w:rPr>
@@ -20777,6 +21431,7 @@
         <w:spacing w:after="80"/>
         <w:jc w:val="both"/>
         <w:rPr>
+          <w:rFonts w:ascii="Times New Roman" w:hAnsi="Times New Roman" w:cs="Times New Roman"/>
           <w:sz w:val="24"/>
           <w:szCs w:val="24"/>
         </w:rPr>
@@ -20836,12 +21491,14 @@
         <w:spacing w:before="120" w:after="40"/>
         <w:jc w:val="center"/>
         <w:rPr>
+          <w:rFonts w:ascii="Times New Roman" w:hAnsi="Times New Roman" w:cs="Times New Roman"/>
           <w:sz w:val="24"/>
           <w:szCs w:val="24"/>
         </w:rPr>
       </w:pPr>
       <w:r>
         <w:rPr>
+          <w:rFonts w:ascii="Times New Roman" w:hAnsi="Times New Roman" w:cs="Times New Roman"/>
           <w:noProof/>
           <w:sz w:val="24"/>
           <w:szCs w:val="24"/>
@@ -20891,6 +21548,7 @@
         <w:spacing w:after="120"/>
         <w:jc w:val="center"/>
         <w:rPr>
+          <w:rFonts w:ascii="Times New Roman" w:hAnsi="Times New Roman" w:cs="Times New Roman"/>
           <w:sz w:val="24"/>
           <w:szCs w:val="24"/>
         </w:rPr>
@@ -21181,6 +21839,7 @@
         <w:spacing w:after="80"/>
         <w:jc w:val="both"/>
         <w:rPr>
+          <w:rFonts w:ascii="Times New Roman" w:hAnsi="Times New Roman" w:cs="Times New Roman"/>
           <w:sz w:val="24"/>
           <w:szCs w:val="24"/>
         </w:rPr>
@@ -21200,6 +21859,7 @@
         <w:spacing w:after="40"/>
         <w:ind w:left="360"/>
         <w:rPr>
+          <w:rFonts w:ascii="Times New Roman" w:hAnsi="Times New Roman" w:cs="Times New Roman"/>
           <w:sz w:val="24"/>
           <w:szCs w:val="24"/>
         </w:rPr>
@@ -21215,7 +21875,7 @@
       </w:r>
       <w:r>
         <w:rPr>
-          <w:rFonts w:ascii="Consolas" w:hAnsi="Consolas" w:cs="Consolas"/>
+          <w:rFonts w:ascii="Times New Roman" w:hAnsi="Times New Roman" w:cs="Times New Roman"/>
           <w:sz w:val="24"/>
           <w:szCs w:val="24"/>
         </w:rPr>
@@ -21227,6 +21887,7 @@
         <w:spacing w:after="80"/>
         <w:jc w:val="both"/>
         <w:rPr>
+          <w:rFonts w:ascii="Times New Roman" w:hAnsi="Times New Roman" w:cs="Times New Roman"/>
           <w:sz w:val="24"/>
           <w:szCs w:val="24"/>
         </w:rPr>
@@ -21246,13 +21907,14 @@
         <w:spacing w:after="40"/>
         <w:ind w:left="360"/>
         <w:rPr>
+          <w:rFonts w:ascii="Times New Roman" w:hAnsi="Times New Roman" w:cs="Times New Roman"/>
           <w:sz w:val="24"/>
           <w:szCs w:val="24"/>
         </w:rPr>
       </w:pPr>
       <w:r>
         <w:rPr>
-          <w:rFonts w:ascii="Consolas" w:hAnsi="Consolas" w:cs="Consolas"/>
+          <w:rFonts w:ascii="Times New Roman" w:hAnsi="Times New Roman" w:cs="Times New Roman"/>
           <w:b/>
           <w:sz w:val="24"/>
           <w:szCs w:val="24"/>
@@ -21481,13 +22143,14 @@
         <w:spacing w:after="40"/>
         <w:ind w:left="360"/>
         <w:rPr>
+          <w:rFonts w:ascii="Times New Roman" w:hAnsi="Times New Roman" w:cs="Times New Roman"/>
           <w:sz w:val="24"/>
           <w:szCs w:val="24"/>
         </w:rPr>
       </w:pPr>
       <w:r>
         <w:rPr>
-          <w:rFonts w:ascii="Consolas" w:hAnsi="Consolas" w:cs="Consolas"/>
+          <w:rFonts w:ascii="Times New Roman" w:hAnsi="Times New Roman" w:cs="Times New Roman"/>
           <w:b/>
           <w:sz w:val="24"/>
           <w:szCs w:val="24"/>
@@ -21680,13 +22343,14 @@
         <w:spacing w:after="40"/>
         <w:ind w:left="360"/>
         <w:rPr>
+          <w:rFonts w:ascii="Times New Roman" w:hAnsi="Times New Roman" w:cs="Times New Roman"/>
           <w:sz w:val="24"/>
           <w:szCs w:val="24"/>
         </w:rPr>
       </w:pPr>
       <w:r>
         <w:rPr>
-          <w:rFonts w:ascii="Consolas" w:hAnsi="Consolas" w:cs="Consolas"/>
+          <w:rFonts w:ascii="Times New Roman" w:hAnsi="Times New Roman" w:cs="Times New Roman"/>
           <w:b/>
           <w:sz w:val="24"/>
           <w:szCs w:val="24"/>
@@ -21889,13 +22553,14 @@
         <w:spacing w:after="40"/>
         <w:ind w:left="360"/>
         <w:rPr>
+          <w:rFonts w:ascii="Times New Roman" w:hAnsi="Times New Roman" w:cs="Times New Roman"/>
           <w:sz w:val="24"/>
           <w:szCs w:val="24"/>
         </w:rPr>
       </w:pPr>
       <w:r>
         <w:rPr>
-          <w:rFonts w:ascii="Consolas" w:hAnsi="Consolas" w:cs="Consolas"/>
+          <w:rFonts w:ascii="Times New Roman" w:hAnsi="Times New Roman" w:cs="Times New Roman"/>
           <w:b/>
           <w:sz w:val="24"/>
           <w:szCs w:val="24"/>
@@ -22130,65 +22795,113 @@
     <w:p>
       <w:pPr>
         <w:pStyle w:val="Heading2"/>
+        <w:rPr>
+          <w:rFonts w:cs="Times New Roman"/>
+        </w:rPr>
       </w:pPr>
       <w:bookmarkStart w:id="15" w:name="_Toc243839310"/>
       <w:r>
+        <w:rPr>
+          <w:rFonts w:cs="Times New Roman"/>
+        </w:rPr>
         <w:t xml:space="preserve">STEP 12 — </w:t>
       </w:r>
       <w:proofErr w:type="spellStart"/>
       <w:r>
+        <w:rPr>
+          <w:rFonts w:cs="Times New Roman"/>
+        </w:rPr>
         <w:t>Xây</w:t>
       </w:r>
       <w:proofErr w:type="spellEnd"/>
       <w:r>
-        <w:t xml:space="preserve"> </w:t>
-      </w:r>
-      <w:proofErr w:type="spellStart"/>
-      <w:r>
+        <w:rPr>
+          <w:rFonts w:cs="Times New Roman"/>
+        </w:rPr>
+        <w:t xml:space="preserve"> </w:t>
+      </w:r>
+      <w:proofErr w:type="spellStart"/>
+      <w:r>
+        <w:rPr>
+          <w:rFonts w:cs="Times New Roman"/>
+        </w:rPr>
         <w:t>dựng</w:t>
       </w:r>
       <w:proofErr w:type="spellEnd"/>
       <w:r>
+        <w:rPr>
+          <w:rFonts w:cs="Times New Roman"/>
+        </w:rPr>
         <w:t xml:space="preserve"> Form </w:t>
       </w:r>
       <w:proofErr w:type="spellStart"/>
       <w:r>
+        <w:rPr>
+          <w:rFonts w:cs="Times New Roman"/>
+        </w:rPr>
         <w:t>thêm</w:t>
       </w:r>
       <w:proofErr w:type="spellEnd"/>
       <w:r>
-        <w:t xml:space="preserve"> </w:t>
-      </w:r>
-      <w:proofErr w:type="spellStart"/>
-      <w:r>
+        <w:rPr>
+          <w:rFonts w:cs="Times New Roman"/>
+        </w:rPr>
+        <w:t xml:space="preserve"> </w:t>
+      </w:r>
+      <w:proofErr w:type="spellStart"/>
+      <w:r>
+        <w:rPr>
+          <w:rFonts w:cs="Times New Roman"/>
+        </w:rPr>
         <w:t>mới</w:t>
       </w:r>
       <w:proofErr w:type="spellEnd"/>
       <w:r>
+        <w:rPr>
+          <w:rFonts w:cs="Times New Roman"/>
+        </w:rPr>
         <w:t xml:space="preserve"> / </w:t>
       </w:r>
       <w:proofErr w:type="spellStart"/>
       <w:r>
+        <w:rPr>
+          <w:rFonts w:cs="Times New Roman"/>
+        </w:rPr>
         <w:t>Cập</w:t>
       </w:r>
       <w:proofErr w:type="spellEnd"/>
       <w:r>
-        <w:t xml:space="preserve"> </w:t>
-      </w:r>
-      <w:proofErr w:type="spellStart"/>
-      <w:r>
+        <w:rPr>
+          <w:rFonts w:cs="Times New Roman"/>
+        </w:rPr>
+        <w:t xml:space="preserve"> </w:t>
+      </w:r>
+      <w:proofErr w:type="spellStart"/>
+      <w:r>
+        <w:rPr>
+          <w:rFonts w:cs="Times New Roman"/>
+        </w:rPr>
         <w:t>nhật</w:t>
       </w:r>
       <w:proofErr w:type="spellEnd"/>
       <w:r>
-        <w:t xml:space="preserve"> </w:t>
-      </w:r>
-      <w:proofErr w:type="spellStart"/>
-      <w:r>
+        <w:rPr>
+          <w:rFonts w:cs="Times New Roman"/>
+        </w:rPr>
+        <w:t xml:space="preserve"> </w:t>
+      </w:r>
+      <w:proofErr w:type="spellStart"/>
+      <w:r>
+        <w:rPr>
+          <w:rFonts w:cs="Times New Roman"/>
+        </w:rPr>
         <w:t>có</w:t>
       </w:r>
       <w:proofErr w:type="spellEnd"/>
       <w:r>
+        <w:rPr>
+          <w:rFonts w:cs="Times New Roman"/>
+        </w:rPr>
         <w:t xml:space="preserve"> Validation (TODO 15 – 16)</w:t>
       </w:r>
       <w:bookmarkEnd w:id="15"/>
@@ -22198,6 +22911,7 @@
         <w:spacing w:after="80"/>
         <w:jc w:val="both"/>
         <w:rPr>
+          <w:rFonts w:ascii="Times New Roman" w:hAnsi="Times New Roman" w:cs="Times New Roman"/>
           <w:sz w:val="24"/>
           <w:szCs w:val="24"/>
         </w:rPr>
@@ -22882,6 +23596,7 @@
         <w:spacing w:after="80"/>
         <w:jc w:val="both"/>
         <w:rPr>
+          <w:rFonts w:ascii="Times New Roman" w:hAnsi="Times New Roman" w:cs="Times New Roman"/>
           <w:sz w:val="24"/>
           <w:szCs w:val="24"/>
         </w:rPr>
@@ -22941,12 +23656,14 @@
         <w:spacing w:before="120" w:after="40"/>
         <w:jc w:val="center"/>
         <w:rPr>
+          <w:rFonts w:ascii="Times New Roman" w:hAnsi="Times New Roman" w:cs="Times New Roman"/>
           <w:sz w:val="24"/>
           <w:szCs w:val="24"/>
         </w:rPr>
       </w:pPr>
       <w:r>
         <w:rPr>
+          <w:rFonts w:ascii="Times New Roman" w:hAnsi="Times New Roman" w:cs="Times New Roman"/>
           <w:noProof/>
           <w:sz w:val="24"/>
           <w:szCs w:val="24"/>
@@ -22996,6 +23713,7 @@
         <w:spacing w:after="120"/>
         <w:jc w:val="center"/>
         <w:rPr>
+          <w:rFonts w:ascii="Times New Roman" w:hAnsi="Times New Roman" w:cs="Times New Roman"/>
           <w:sz w:val="24"/>
           <w:szCs w:val="24"/>
         </w:rPr>
@@ -23166,12 +23884,14 @@
         <w:spacing w:before="120" w:after="40"/>
         <w:jc w:val="center"/>
         <w:rPr>
+          <w:rFonts w:ascii="Times New Roman" w:hAnsi="Times New Roman" w:cs="Times New Roman"/>
           <w:sz w:val="24"/>
           <w:szCs w:val="24"/>
         </w:rPr>
       </w:pPr>
       <w:r>
         <w:rPr>
+          <w:rFonts w:ascii="Times New Roman" w:hAnsi="Times New Roman" w:cs="Times New Roman"/>
           <w:noProof/>
           <w:sz w:val="24"/>
           <w:szCs w:val="24"/>
@@ -23220,6 +23940,7 @@
         <w:spacing w:after="120"/>
         <w:jc w:val="center"/>
         <w:rPr>
+          <w:rFonts w:ascii="Times New Roman" w:hAnsi="Times New Roman" w:cs="Times New Roman"/>
           <w:sz w:val="24"/>
           <w:szCs w:val="24"/>
         </w:rPr>
@@ -23479,6 +24200,7 @@
         <w:spacing w:after="80"/>
         <w:jc w:val="both"/>
         <w:rPr>
+          <w:rFonts w:ascii="Times New Roman" w:hAnsi="Times New Roman" w:cs="Times New Roman"/>
           <w:sz w:val="24"/>
           <w:szCs w:val="24"/>
         </w:rPr>
@@ -23498,6 +24220,7 @@
         <w:spacing w:after="40"/>
         <w:ind w:left="360"/>
         <w:rPr>
+          <w:rFonts w:ascii="Times New Roman" w:hAnsi="Times New Roman" w:cs="Times New Roman"/>
           <w:sz w:val="24"/>
           <w:szCs w:val="24"/>
         </w:rPr>
@@ -23509,12 +24232,11 @@
           <w:sz w:val="24"/>
           <w:szCs w:val="24"/>
         </w:rPr>
-        <w:lastRenderedPageBreak/>
         <w:t xml:space="preserve">◦ </w:t>
       </w:r>
       <w:r>
         <w:rPr>
-          <w:rFonts w:ascii="Consolas" w:hAnsi="Consolas" w:cs="Consolas"/>
+          <w:rFonts w:ascii="Times New Roman" w:hAnsi="Times New Roman" w:cs="Times New Roman"/>
           <w:sz w:val="24"/>
           <w:szCs w:val="24"/>
         </w:rPr>
@@ -23526,6 +24248,7 @@
         <w:spacing w:after="80"/>
         <w:jc w:val="both"/>
         <w:rPr>
+          <w:rFonts w:ascii="Times New Roman" w:hAnsi="Times New Roman" w:cs="Times New Roman"/>
           <w:sz w:val="24"/>
           <w:szCs w:val="24"/>
         </w:rPr>
@@ -23537,6 +24260,7 @@
           <w:sz w:val="24"/>
           <w:szCs w:val="24"/>
         </w:rPr>
+        <w:lastRenderedPageBreak/>
         <w:t>● Checklist:</w:t>
       </w:r>
     </w:p>
@@ -23545,13 +24269,14 @@
         <w:spacing w:after="40"/>
         <w:ind w:left="360"/>
         <w:rPr>
+          <w:rFonts w:ascii="Times New Roman" w:hAnsi="Times New Roman" w:cs="Times New Roman"/>
           <w:sz w:val="24"/>
           <w:szCs w:val="24"/>
         </w:rPr>
       </w:pPr>
       <w:r>
         <w:rPr>
-          <w:rFonts w:ascii="Consolas" w:hAnsi="Consolas" w:cs="Consolas"/>
+          <w:rFonts w:ascii="Times New Roman" w:hAnsi="Times New Roman" w:cs="Times New Roman"/>
           <w:b/>
           <w:sz w:val="24"/>
           <w:szCs w:val="24"/>
@@ -23842,13 +24567,14 @@
         <w:spacing w:after="40"/>
         <w:ind w:left="360"/>
         <w:rPr>
+          <w:rFonts w:ascii="Times New Roman" w:hAnsi="Times New Roman" w:cs="Times New Roman"/>
           <w:sz w:val="24"/>
           <w:szCs w:val="24"/>
         </w:rPr>
       </w:pPr>
       <w:r>
         <w:rPr>
-          <w:rFonts w:ascii="Consolas" w:hAnsi="Consolas" w:cs="Consolas"/>
+          <w:rFonts w:ascii="Times New Roman" w:hAnsi="Times New Roman" w:cs="Times New Roman"/>
           <w:b/>
           <w:sz w:val="24"/>
           <w:szCs w:val="24"/>
@@ -24103,13 +24829,14 @@
         <w:spacing w:after="40"/>
         <w:ind w:left="360"/>
         <w:rPr>
+          <w:rFonts w:ascii="Times New Roman" w:hAnsi="Times New Roman" w:cs="Times New Roman"/>
           <w:sz w:val="24"/>
           <w:szCs w:val="24"/>
         </w:rPr>
       </w:pPr>
       <w:r>
         <w:rPr>
-          <w:rFonts w:ascii="Consolas" w:hAnsi="Consolas" w:cs="Consolas"/>
+          <w:rFonts w:ascii="Times New Roman" w:hAnsi="Times New Roman" w:cs="Times New Roman"/>
           <w:b/>
           <w:sz w:val="24"/>
           <w:szCs w:val="24"/>
@@ -24400,13 +25127,14 @@
         <w:spacing w:after="40"/>
         <w:ind w:left="360"/>
         <w:rPr>
+          <w:rFonts w:ascii="Times New Roman" w:hAnsi="Times New Roman" w:cs="Times New Roman"/>
           <w:sz w:val="24"/>
           <w:szCs w:val="24"/>
         </w:rPr>
       </w:pPr>
       <w:r>
         <w:rPr>
-          <w:rFonts w:ascii="Consolas" w:hAnsi="Consolas" w:cs="Consolas"/>
+          <w:rFonts w:ascii="Times New Roman" w:hAnsi="Times New Roman" w:cs="Times New Roman"/>
           <w:b/>
           <w:sz w:val="24"/>
           <w:szCs w:val="24"/>
@@ -24634,6 +25362,7 @@
       <w:pPr>
         <w:spacing w:after="80"/>
         <w:rPr>
+          <w:rFonts w:ascii="Times New Roman" w:hAnsi="Times New Roman" w:cs="Times New Roman"/>
           <w:sz w:val="24"/>
           <w:szCs w:val="24"/>
         </w:rPr>
@@ -24642,38 +25371,65 @@
     <w:p>
       <w:pPr>
         <w:pStyle w:val="Heading1"/>
+        <w:rPr>
+          <w:rFonts w:cs="Times New Roman"/>
+        </w:rPr>
       </w:pPr>
       <w:bookmarkStart w:id="16" w:name="_Toc243839311"/>
       <w:proofErr w:type="spellStart"/>
       <w:r>
+        <w:rPr>
+          <w:rFonts w:cs="Times New Roman"/>
+        </w:rPr>
         <w:t>Nghiệm</w:t>
       </w:r>
       <w:proofErr w:type="spellEnd"/>
       <w:r>
-        <w:t xml:space="preserve"> </w:t>
-      </w:r>
-      <w:proofErr w:type="spellStart"/>
-      <w:r>
+        <w:rPr>
+          <w:rFonts w:cs="Times New Roman"/>
+        </w:rPr>
+        <w:t xml:space="preserve"> </w:t>
+      </w:r>
+      <w:proofErr w:type="spellStart"/>
+      <w:r>
+        <w:rPr>
+          <w:rFonts w:cs="Times New Roman"/>
+        </w:rPr>
         <w:t>thu</w:t>
       </w:r>
       <w:proofErr w:type="spellEnd"/>
       <w:r>
+        <w:rPr>
+          <w:rFonts w:cs="Times New Roman"/>
+        </w:rPr>
         <w:t xml:space="preserve"> &amp; </w:t>
       </w:r>
       <w:proofErr w:type="spellStart"/>
       <w:r>
+        <w:rPr>
+          <w:rFonts w:cs="Times New Roman"/>
+        </w:rPr>
         <w:t>Kiểm</w:t>
       </w:r>
       <w:proofErr w:type="spellEnd"/>
       <w:r>
-        <w:t xml:space="preserve"> </w:t>
-      </w:r>
-      <w:proofErr w:type="spellStart"/>
-      <w:r>
+        <w:rPr>
+          <w:rFonts w:cs="Times New Roman"/>
+        </w:rPr>
+        <w:t xml:space="preserve"> </w:t>
+      </w:r>
+      <w:proofErr w:type="spellStart"/>
+      <w:r>
+        <w:rPr>
+          <w:rFonts w:cs="Times New Roman"/>
+        </w:rPr>
         <w:t>thử</w:t>
       </w:r>
       <w:proofErr w:type="spellEnd"/>
       <w:r>
+        <w:rPr>
+          <w:rFonts w:cs="Times New Roman"/>
+        </w:rPr>
         <w:t xml:space="preserve"> (STEP 13)</w:t>
       </w:r>
       <w:bookmarkEnd w:id="16"/>
@@ -24681,49 +25437,71 @@
     <w:p>
       <w:pPr>
         <w:pStyle w:val="Heading2"/>
+        <w:rPr>
+          <w:rFonts w:cs="Times New Roman"/>
+        </w:rPr>
       </w:pPr>
       <w:bookmarkStart w:id="17" w:name="_Toc243839312"/>
       <w:r>
-        <w:t xml:space="preserve">STEP 13 — </w:t>
-      </w:r>
-      <w:proofErr w:type="spellStart"/>
-      <w:r>
-        <w:t>Chạy</w:t>
-      </w:r>
-      <w:proofErr w:type="spellEnd"/>
-      <w:r>
-        <w:t xml:space="preserve"> </w:t>
-      </w:r>
-      <w:proofErr w:type="spellStart"/>
-      <w:r>
+        <w:rPr>
+          <w:rFonts w:cs="Times New Roman"/>
+        </w:rPr>
+        <w:t xml:space="preserve">STEP 13 — Chạy </w:t>
+      </w:r>
+      <w:proofErr w:type="spellStart"/>
+      <w:r>
+        <w:rPr>
+          <w:rFonts w:cs="Times New Roman"/>
+        </w:rPr>
         <w:t>ứng</w:t>
       </w:r>
       <w:proofErr w:type="spellEnd"/>
       <w:r>
-        <w:t xml:space="preserve"> </w:t>
-      </w:r>
-      <w:proofErr w:type="spellStart"/>
-      <w:r>
+        <w:rPr>
+          <w:rFonts w:cs="Times New Roman"/>
+        </w:rPr>
+        <w:t xml:space="preserve"> </w:t>
+      </w:r>
+      <w:proofErr w:type="spellStart"/>
+      <w:r>
+        <w:rPr>
+          <w:rFonts w:cs="Times New Roman"/>
+        </w:rPr>
         <w:t>dụng</w:t>
       </w:r>
       <w:proofErr w:type="spellEnd"/>
       <w:r>
+        <w:rPr>
+          <w:rFonts w:cs="Times New Roman"/>
+        </w:rPr>
         <w:t xml:space="preserve">, </w:t>
       </w:r>
       <w:proofErr w:type="spellStart"/>
       <w:r>
+        <w:rPr>
+          <w:rFonts w:cs="Times New Roman"/>
+        </w:rPr>
         <w:t>Kiểm</w:t>
       </w:r>
       <w:proofErr w:type="spellEnd"/>
       <w:r>
-        <w:t xml:space="preserve"> </w:t>
-      </w:r>
-      <w:proofErr w:type="spellStart"/>
-      <w:r>
+        <w:rPr>
+          <w:rFonts w:cs="Times New Roman"/>
+        </w:rPr>
+        <w:t xml:space="preserve"> </w:t>
+      </w:r>
+      <w:proofErr w:type="spellStart"/>
+      <w:r>
+        <w:rPr>
+          <w:rFonts w:cs="Times New Roman"/>
+        </w:rPr>
         <w:t>thử</w:t>
       </w:r>
       <w:proofErr w:type="spellEnd"/>
       <w:r>
+        <w:rPr>
+          <w:rFonts w:cs="Times New Roman"/>
+        </w:rPr>
         <w:t xml:space="preserve"> Offline &amp; Git Log</w:t>
       </w:r>
       <w:bookmarkEnd w:id="17"/>
@@ -24733,6 +25511,7 @@
         <w:spacing w:after="80"/>
         <w:jc w:val="both"/>
         <w:rPr>
+          <w:rFonts w:ascii="Times New Roman" w:hAnsi="Times New Roman" w:cs="Times New Roman"/>
           <w:sz w:val="24"/>
           <w:szCs w:val="24"/>
         </w:rPr>
@@ -25445,6 +26224,7 @@
         <w:spacing w:after="80"/>
         <w:jc w:val="both"/>
         <w:rPr>
+          <w:rFonts w:ascii="Times New Roman" w:hAnsi="Times New Roman" w:cs="Times New Roman"/>
           <w:sz w:val="24"/>
           <w:szCs w:val="24"/>
         </w:rPr>
@@ -25504,12 +26284,15 @@
         <w:spacing w:before="120" w:after="40"/>
         <w:jc w:val="center"/>
         <w:rPr>
+          <w:rFonts w:ascii="Times New Roman" w:hAnsi="Times New Roman" w:cs="Times New Roman"/>
           <w:sz w:val="24"/>
           <w:szCs w:val="24"/>
         </w:rPr>
       </w:pPr>
       <w:r>
         <w:rPr>
+          <w:rFonts w:ascii="Times New Roman" w:hAnsi="Times New Roman" w:cs="Times New Roman"/>
+          <w:noProof/>
           <w:sz w:val="24"/>
           <w:szCs w:val="24"/>
         </w:rPr>
@@ -25555,6 +26338,7 @@
         <w:spacing w:after="120"/>
         <w:jc w:val="center"/>
         <w:rPr>
+          <w:rFonts w:ascii="Times New Roman" w:hAnsi="Times New Roman" w:cs="Times New Roman"/>
           <w:sz w:val="24"/>
           <w:szCs w:val="24"/>
         </w:rPr>
@@ -25825,6 +26609,7 @@
         <w:spacing w:after="80"/>
         <w:jc w:val="both"/>
         <w:rPr>
+          <w:rFonts w:ascii="Times New Roman" w:hAnsi="Times New Roman" w:cs="Times New Roman"/>
           <w:sz w:val="24"/>
           <w:szCs w:val="24"/>
         </w:rPr>
@@ -25844,6 +26629,7 @@
         <w:spacing w:after="40"/>
         <w:ind w:left="360"/>
         <w:rPr>
+          <w:rFonts w:ascii="Times New Roman" w:hAnsi="Times New Roman" w:cs="Times New Roman"/>
           <w:sz w:val="24"/>
           <w:szCs w:val="24"/>
         </w:rPr>
@@ -25859,7 +26645,7 @@
       </w:r>
       <w:r>
         <w:rPr>
-          <w:rFonts w:ascii="Consolas" w:hAnsi="Consolas" w:cs="Consolas"/>
+          <w:rFonts w:ascii="Times New Roman" w:hAnsi="Times New Roman" w:cs="Times New Roman"/>
           <w:sz w:val="24"/>
           <w:szCs w:val="24"/>
         </w:rPr>
@@ -25871,6 +26657,7 @@
         <w:spacing w:after="80"/>
         <w:jc w:val="both"/>
         <w:rPr>
+          <w:rFonts w:ascii="Times New Roman" w:hAnsi="Times New Roman" w:cs="Times New Roman"/>
           <w:sz w:val="24"/>
           <w:szCs w:val="24"/>
         </w:rPr>
@@ -25890,13 +26677,14 @@
         <w:spacing w:after="40"/>
         <w:ind w:left="360"/>
         <w:rPr>
+          <w:rFonts w:ascii="Times New Roman" w:hAnsi="Times New Roman" w:cs="Times New Roman"/>
           <w:sz w:val="24"/>
           <w:szCs w:val="24"/>
         </w:rPr>
       </w:pPr>
       <w:r>
         <w:rPr>
-          <w:rFonts w:ascii="Consolas" w:hAnsi="Consolas" w:cs="Consolas"/>
+          <w:rFonts w:ascii="Times New Roman" w:hAnsi="Times New Roman" w:cs="Times New Roman"/>
           <w:b/>
           <w:sz w:val="24"/>
           <w:szCs w:val="24"/>
@@ -26161,13 +26949,14 @@
         <w:spacing w:after="40"/>
         <w:ind w:left="360"/>
         <w:rPr>
+          <w:rFonts w:ascii="Times New Roman" w:hAnsi="Times New Roman" w:cs="Times New Roman"/>
           <w:sz w:val="24"/>
           <w:szCs w:val="24"/>
         </w:rPr>
       </w:pPr>
       <w:r>
         <w:rPr>
-          <w:rFonts w:ascii="Consolas" w:hAnsi="Consolas" w:cs="Consolas"/>
+          <w:rFonts w:ascii="Times New Roman" w:hAnsi="Times New Roman" w:cs="Times New Roman"/>
           <w:b/>
           <w:sz w:val="24"/>
           <w:szCs w:val="24"/>
@@ -26378,13 +27167,14 @@
         <w:spacing w:after="40"/>
         <w:ind w:left="360"/>
         <w:rPr>
+          <w:rFonts w:ascii="Times New Roman" w:hAnsi="Times New Roman" w:cs="Times New Roman"/>
           <w:sz w:val="24"/>
           <w:szCs w:val="24"/>
         </w:rPr>
       </w:pPr>
       <w:r>
         <w:rPr>
-          <w:rFonts w:ascii="Consolas" w:hAnsi="Consolas" w:cs="Consolas"/>
+          <w:rFonts w:ascii="Times New Roman" w:hAnsi="Times New Roman" w:cs="Times New Roman"/>
           <w:b/>
           <w:sz w:val="24"/>
           <w:szCs w:val="24"/>
@@ -26649,13 +27439,14 @@
         <w:spacing w:after="40"/>
         <w:ind w:left="360"/>
         <w:rPr>
+          <w:rFonts w:ascii="Times New Roman" w:hAnsi="Times New Roman" w:cs="Times New Roman"/>
           <w:sz w:val="24"/>
           <w:szCs w:val="24"/>
         </w:rPr>
       </w:pPr>
       <w:r>
         <w:rPr>
-          <w:rFonts w:ascii="Consolas" w:hAnsi="Consolas" w:cs="Consolas"/>
+          <w:rFonts w:ascii="Times New Roman" w:hAnsi="Times New Roman" w:cs="Times New Roman"/>
           <w:b/>
           <w:sz w:val="24"/>
           <w:szCs w:val="24"/>
@@ -26883,6 +27674,7 @@
       <w:pPr>
         <w:spacing w:after="80"/>
         <w:rPr>
+          <w:rFonts w:ascii="Times New Roman" w:hAnsi="Times New Roman" w:cs="Times New Roman"/>
           <w:sz w:val="24"/>
           <w:szCs w:val="24"/>
         </w:rPr>
@@ -26891,43 +27683,72 @@
     <w:p>
       <w:pPr>
         <w:pStyle w:val="Heading1"/>
+        <w:rPr>
+          <w:rFonts w:cs="Times New Roman"/>
+        </w:rPr>
       </w:pPr>
       <w:bookmarkStart w:id="18" w:name="_Toc243839313"/>
       <w:proofErr w:type="spellStart"/>
       <w:r>
-        <w:lastRenderedPageBreak/>
+        <w:rPr>
+          <w:rFonts w:cs="Times New Roman"/>
+        </w:rPr>
         <w:t>Kết</w:t>
       </w:r>
       <w:proofErr w:type="spellEnd"/>
       <w:r>
-        <w:t xml:space="preserve"> </w:t>
-      </w:r>
-      <w:proofErr w:type="spellStart"/>
-      <w:r>
+        <w:rPr>
+          <w:rFonts w:cs="Times New Roman"/>
+        </w:rPr>
+        <w:t xml:space="preserve"> </w:t>
+      </w:r>
+      <w:proofErr w:type="spellStart"/>
+      <w:r>
+        <w:rPr>
+          <w:rFonts w:cs="Times New Roman"/>
+        </w:rPr>
         <w:t>luận</w:t>
       </w:r>
       <w:proofErr w:type="spellEnd"/>
       <w:r>
+        <w:rPr>
+          <w:rFonts w:cs="Times New Roman"/>
+        </w:rPr>
         <w:t xml:space="preserve"> &amp; </w:t>
       </w:r>
       <w:proofErr w:type="spellStart"/>
       <w:r>
+        <w:rPr>
+          <w:rFonts w:cs="Times New Roman"/>
+        </w:rPr>
         <w:t>Đánh</w:t>
       </w:r>
       <w:proofErr w:type="spellEnd"/>
       <w:r>
-        <w:t xml:space="preserve"> </w:t>
-      </w:r>
-      <w:proofErr w:type="spellStart"/>
-      <w:r>
+        <w:rPr>
+          <w:rFonts w:cs="Times New Roman"/>
+        </w:rPr>
+        <w:t xml:space="preserve"> </w:t>
+      </w:r>
+      <w:proofErr w:type="spellStart"/>
+      <w:r>
+        <w:rPr>
+          <w:rFonts w:cs="Times New Roman"/>
+        </w:rPr>
         <w:t>giá</w:t>
       </w:r>
       <w:proofErr w:type="spellEnd"/>
       <w:r>
-        <w:t xml:space="preserve"> </w:t>
-      </w:r>
-      <w:proofErr w:type="spellStart"/>
-      <w:r>
+        <w:rPr>
+          <w:rFonts w:cs="Times New Roman"/>
+        </w:rPr>
+        <w:t xml:space="preserve"> </w:t>
+      </w:r>
+      <w:proofErr w:type="spellStart"/>
+      <w:r>
+        <w:rPr>
+          <w:rFonts w:cs="Times New Roman"/>
+        </w:rPr>
         <w:t>chung</w:t>
       </w:r>
       <w:bookmarkEnd w:id="18"/>
@@ -26938,6 +27759,7 @@
         <w:spacing w:after="80"/>
         <w:jc w:val="both"/>
         <w:rPr>
+          <w:rFonts w:ascii="Times New Roman" w:hAnsi="Times New Roman" w:cs="Times New Roman"/>
           <w:sz w:val="24"/>
           <w:szCs w:val="24"/>
         </w:rPr>
@@ -27489,6 +28311,7 @@
           <w:sz w:val="24"/>
           <w:szCs w:val="24"/>
         </w:rPr>
+        <w:lastRenderedPageBreak/>
         <w:t>sắc</w:t>
       </w:r>
       <w:proofErr w:type="spellEnd"/>
@@ -29052,6 +29875,7 @@
   <w:style w:type="character" w:default="1" w:styleId="DefaultParagraphFont">
     <w:name w:val="Default Paragraph Font"/>
     <w:uiPriority w:val="1"/>
+    <w:semiHidden/>
     <w:unhideWhenUsed/>
   </w:style>
   <w:style w:type="table" w:default="1" w:styleId="TableNormal">

</xml_diff>